<commit_message>
Keep the already-created DDIC and message class names
Tables ZFI_BUD_FCST_H/_I/_LOG, domains and data elements ZFCST_* and
message class ZBUD_FCST already exist in the system, so the sources,
README and Word TSD reference them again. Programs, classes, interfaces
and transactions keep the separate 2YF names.

Co-Authored-By: Claude Opus 5.5 <noreply@anthropic.com>
Claude-Session: https://claude.ai/code/session_018v514gXErg4EbBGrdeHBh4
</commit_message>
<xml_diff>
--- a/budget_forecast/TSD - Budget Forecast 2YF (ZFI_BUD_2YF).docx
+++ b/budget_forecast/TSD - Budget Forecast 2YF (ZFI_BUD_2YF).docx
@@ -799,7 +799,7 @@
         <w:t xml:space="preserve">not touched</w:t>
       </w:r>
       <w:r>
-        <w:t xml:space="preserve">. All new objects use their own prefix </w:t>
+        <w:t xml:space="preserve">. The new programs, classes and transactions use their own prefix </w:t>
       </w:r>
       <w:r>
         <w:rPr>
@@ -809,7 +809,17 @@
         <w:t xml:space="preserve">2YF</w:t>
       </w:r>
       <w:r>
-        <w:t xml:space="preserve"> (two-year forecast) – e.g. ZFI_BUD_2YF_ENTRY – so no name collides with an existing object.</w:t>
+        <w:t xml:space="preserve"> (two-year forecast) – e.g. ZFI_BUD_2YF_ENTRY – so no name collides with an existing object. The dictionary objects and the message class keep the names </w:t>
+      </w:r>
+      <w:r>
+        <w:rPr>
+          <w:b/>
+          <w:bCs/>
+        </w:rPr>
+        <w:t xml:space="preserve">already created</w:t>
+      </w:r>
+      <w:r>
+        <w:t xml:space="preserve"> in the system (ZFI_BUD_FCST_H/_I/_LOG, ZFCST_*, ZBUD_FCST).</w:t>
       </w:r>
     </w:p>
     <w:p>
@@ -1450,7 +1460,7 @@
           </w:tcPr>
           <w:p>
             <w:r>
-              <w:t xml:space="preserve">Tables</w:t>
+              <w:t xml:space="preserve">Tables (already created)</w:t>
             </w:r>
           </w:p>
         </w:tc>
@@ -1472,7 +1482,7 @@
           </w:tcPr>
           <w:p>
             <w:r>
-              <w:t xml:space="preserve">ZFI_BUD_2YF_H, ZFI_BUD_2YF_I, ZFI_BUD_2YF_LOG</w:t>
+              <w:t xml:space="preserve">ZFI_BUD_FCST_H, ZFI_BUD_FCST_I, ZFI_BUD_FCST_LOG</w:t>
             </w:r>
           </w:p>
         </w:tc>
@@ -1542,7 +1552,7 @@
           </w:tcPr>
           <w:p>
             <w:r>
-              <w:t xml:space="preserve">Message class</w:t>
+              <w:t xml:space="preserve">Message class (already created)</w:t>
             </w:r>
           </w:p>
         </w:tc>
@@ -1564,7 +1574,7 @@
           </w:tcPr>
           <w:p>
             <w:r>
-              <w:t xml:space="preserve">ZBUD_2YF</w:t>
+              <w:t xml:space="preserve">ZBUD_FCST</w:t>
             </w:r>
           </w:p>
         </w:tc>
@@ -1588,7 +1598,7 @@
           </w:tcPr>
           <w:p>
             <w:r>
-              <w:t xml:space="preserve">Domains / data elements</w:t>
+              <w:t xml:space="preserve">Domains / data elements (already created)</w:t>
             </w:r>
           </w:p>
         </w:tc>
@@ -1610,7 +1620,7 @@
           </w:tcPr>
           <w:p>
             <w:r>
-              <w:t xml:space="preserve">Z2YF_*</w:t>
+              <w:t xml:space="preserve">ZFCST_*</w:t>
             </w:r>
           </w:p>
         </w:tc>
@@ -1626,7 +1636,7 @@
         <w:spacing w:after="100"/>
       </w:pPr>
       <w:r>
-        <w:t xml:space="preserve">Before creating the objects, check in SE80 / SE11 that these names are free. If one is already used, rename that object and replace the name in the sources.</w:t>
+        <w:t xml:space="preserve">Tables, domains, data elements and message class are already created with these names. For programs, classes, interfaces and transactions check in SE80 / SE24 / SE93 that the names are free; if one is already used, rename that object and replace the name in the sources.</w:t>
       </w:r>
     </w:p>
     <w:p>
@@ -2211,7 +2221,7 @@
           </w:tcPr>
           <w:p>
             <w:r>
-              <w:t xml:space="preserve">Change log table ZFI_BUD_2YF_LOG written on every update; double-click opens a popup ALV with the history.</w:t>
+              <w:t xml:space="preserve">Change log table ZFI_BUD_FCST_LOG written on every update; double-click opens a popup ALV with the history.</w:t>
             </w:r>
           </w:p>
         </w:tc>
@@ -2781,7 +2791,7 @@
           </w:tcPr>
           <w:p>
             <w:r>
-              <w:t xml:space="preserve">All errors as T100 messages of ZBUD_2YF (IF_T100_DYN_MSG); carries the item field and line for the cursor.</w:t>
+              <w:t xml:space="preserve">All errors as T100 messages of ZBUD_FCST (IF_T100_DYN_MSG); carries the item field and line for the cursor.</w:t>
             </w:r>
           </w:p>
         </w:tc>
@@ -3525,7 +3535,7 @@
         <w:spacing w:after="100"/>
       </w:pPr>
       <w:r>
-        <w:t xml:space="preserve">On every successful update ZCL_FI_BUD_2YF-&gt;BUILD_CHANGE_LOG compares the saved version with the new version and writes one line into ZFI_BUD_2YF_LOG per difference, in the same database LUW as the update:</w:t>
+        <w:t xml:space="preserve">On every successful update ZCL_FI_BUD_2YF-&gt;BUILD_CHANGE_LOG compares the saved version with the new version and writes one line into ZFI_BUD_FCST_LOG per difference, in the same database LUW as the update:</w:t>
       </w:r>
     </w:p>
     <w:tbl>
@@ -4128,7 +4138,22 @@
         <w:pStyle w:val="Heading1"/>
       </w:pPr>
       <w:r>
-        <w:t xml:space="preserve">6. Part A, Step 1 – Data Dictionary (SE11)</w:t>
+        <w:t xml:space="preserve">6. Part A, Step 1 – Data Dictionary (SE11) – already created</w:t>
+      </w:r>
+    </w:p>
+    <w:p>
+      <w:pPr>
+        <w:spacing w:after="100"/>
+      </w:pPr>
+      <w:r>
+        <w:rPr>
+          <w:b/>
+          <w:bCs/>
+        </w:rPr>
+        <w:t xml:space="preserve">These objects already exist in the system.</w:t>
+      </w:r>
+      <w:r>
+        <w:t xml:space="preserve"> Use this chapter only to check that field names and types match the code.</w:t>
       </w:r>
     </w:p>
     <w:p>
@@ -4328,7 +4353,7 @@
           </w:tcPr>
           <w:p>
             <w:r>
-              <w:t xml:space="preserve">Z2YF_PRIORITY</w:t>
+              <w:t xml:space="preserve">ZFCST_PRIORITY</w:t>
             </w:r>
           </w:p>
         </w:tc>
@@ -4428,7 +4453,7 @@
           </w:tcPr>
           <w:p>
             <w:r>
-              <w:t xml:space="preserve">Z2YF_BUD_TYPE</w:t>
+              <w:t xml:space="preserve">ZFCST_BUD_TYPE</w:t>
             </w:r>
           </w:p>
         </w:tc>
@@ -4523,7 +4548,7 @@
           </w:tcPr>
           <w:p>
             <w:r>
-              <w:t xml:space="preserve">Z2YF_PROJ_TYPE</w:t>
+              <w:t xml:space="preserve">ZFCST_PROJ_TYPE</w:t>
             </w:r>
           </w:p>
         </w:tc>
@@ -4618,7 +4643,7 @@
           </w:tcPr>
           <w:p>
             <w:r>
-              <w:t xml:space="preserve">Z2YF_CHG_IND</w:t>
+              <w:t xml:space="preserve">ZFCST_CHG_IND</w:t>
             </w:r>
           </w:p>
         </w:tc>
@@ -4718,7 +4743,7 @@
           </w:tcPr>
           <w:p>
             <w:r>
-              <w:t xml:space="preserve">Z2YF_AMOUNT</w:t>
+              <w:t xml:space="preserve">ZFCST_AMOUNT</w:t>
             </w:r>
           </w:p>
         </w:tc>
@@ -4808,7 +4833,7 @@
           </w:tcPr>
           <w:p>
             <w:r>
-              <w:t xml:space="preserve">Z2YF_ITEM_NO</w:t>
+              <w:t xml:space="preserve">ZFCST_ITEM_NO</w:t>
             </w:r>
           </w:p>
         </w:tc>
@@ -4898,7 +4923,7 @@
           </w:tcPr>
           <w:p>
             <w:r>
-              <w:t xml:space="preserve">Z2YF_TEXT100</w:t>
+              <w:t xml:space="preserve">ZFCST_TEXT100</w:t>
             </w:r>
           </w:p>
         </w:tc>
@@ -4988,7 +5013,7 @@
           </w:tcPr>
           <w:p>
             <w:r>
-              <w:t xml:space="preserve">Z2YF_TEXT255</w:t>
+              <w:t xml:space="preserve">ZFCST_TEXT255</w:t>
             </w:r>
           </w:p>
         </w:tc>
@@ -5208,7 +5233,7 @@
           </w:tcPr>
           <w:p>
             <w:r>
-              <w:t xml:space="preserve">Z2YF_YEAR_FROM</w:t>
+              <w:t xml:space="preserve">ZFCST_YEAR_FROM</w:t>
             </w:r>
           </w:p>
         </w:tc>
@@ -5276,7 +5301,7 @@
           </w:tcPr>
           <w:p>
             <w:r>
-              <w:t xml:space="preserve">Z2YF_YEAR_TO</w:t>
+              <w:t xml:space="preserve">ZFCST_YEAR_TO</w:t>
             </w:r>
           </w:p>
         </w:tc>
@@ -5344,7 +5369,7 @@
           </w:tcPr>
           <w:p>
             <w:r>
-              <w:t xml:space="preserve">Z2YF_BUDGET_YEAR</w:t>
+              <w:t xml:space="preserve">ZFCST_BUDGET_YEAR</w:t>
             </w:r>
           </w:p>
         </w:tc>
@@ -5412,7 +5437,7 @@
           </w:tcPr>
           <w:p>
             <w:r>
-              <w:t xml:space="preserve">Z2YF_ITEM_NO</w:t>
+              <w:t xml:space="preserve">ZFCST_ITEM_NO</w:t>
             </w:r>
           </w:p>
         </w:tc>
@@ -5434,7 +5459,7 @@
           </w:tcPr>
           <w:p>
             <w:r>
-              <w:t xml:space="preserve">Z2YF_ITEM_NO</w:t>
+              <w:t xml:space="preserve">ZFCST_ITEM_NO</w:t>
             </w:r>
           </w:p>
         </w:tc>
@@ -5480,7 +5505,7 @@
           </w:tcPr>
           <w:p>
             <w:r>
-              <w:t xml:space="preserve">Z2YF_LOG_NO</w:t>
+              <w:t xml:space="preserve">ZFCST_LOG_NO</w:t>
             </w:r>
           </w:p>
         </w:tc>
@@ -5502,7 +5527,7 @@
           </w:tcPr>
           <w:p>
             <w:r>
-              <w:t xml:space="preserve">Z2YF_ITEM_NO</w:t>
+              <w:t xml:space="preserve">ZFCST_ITEM_NO</w:t>
             </w:r>
           </w:p>
         </w:tc>
@@ -5548,7 +5573,7 @@
           </w:tcPr>
           <w:p>
             <w:r>
-              <w:t xml:space="preserve">Z2YF_PROJ_NAME</w:t>
+              <w:t xml:space="preserve">ZFCST_PROJ_NAME</w:t>
             </w:r>
           </w:p>
         </w:tc>
@@ -5570,7 +5595,7 @@
           </w:tcPr>
           <w:p>
             <w:r>
-              <w:t xml:space="preserve">Z2YF_TEXT100</w:t>
+              <w:t xml:space="preserve">ZFCST_TEXT100</w:t>
             </w:r>
           </w:p>
         </w:tc>
@@ -5616,7 +5641,7 @@
           </w:tcPr>
           <w:p>
             <w:r>
-              <w:t xml:space="preserve">Z2YF_PROJ_DESC</w:t>
+              <w:t xml:space="preserve">ZFCST_PROJ_DESC</w:t>
             </w:r>
           </w:p>
         </w:tc>
@@ -5638,7 +5663,7 @@
           </w:tcPr>
           <w:p>
             <w:r>
-              <w:t xml:space="preserve">Z2YF_TEXT255</w:t>
+              <w:t xml:space="preserve">ZFCST_TEXT255</w:t>
             </w:r>
           </w:p>
         </w:tc>
@@ -5684,7 +5709,7 @@
           </w:tcPr>
           <w:p>
             <w:r>
-              <w:t xml:space="preserve">Z2YF_PRIORITY</w:t>
+              <w:t xml:space="preserve">ZFCST_PRIORITY</w:t>
             </w:r>
           </w:p>
         </w:tc>
@@ -5706,7 +5731,7 @@
           </w:tcPr>
           <w:p>
             <w:r>
-              <w:t xml:space="preserve">Z2YF_PRIORITY</w:t>
+              <w:t xml:space="preserve">ZFCST_PRIORITY</w:t>
             </w:r>
           </w:p>
         </w:tc>
@@ -5752,7 +5777,7 @@
           </w:tcPr>
           <w:p>
             <w:r>
-              <w:t xml:space="preserve">Z2YF_AMOUNT</w:t>
+              <w:t xml:space="preserve">ZFCST_AMOUNT</w:t>
             </w:r>
           </w:p>
         </w:tc>
@@ -5774,7 +5799,7 @@
           </w:tcPr>
           <w:p>
             <w:r>
-              <w:t xml:space="preserve">Z2YF_AMOUNT</w:t>
+              <w:t xml:space="preserve">ZFCST_AMOUNT</w:t>
             </w:r>
           </w:p>
         </w:tc>
@@ -5820,7 +5845,7 @@
           </w:tcPr>
           <w:p>
             <w:r>
-              <w:t xml:space="preserve">Z2YF_TOTAL_AMOUNT</w:t>
+              <w:t xml:space="preserve">ZFCST_TOTAL_AMOUNT</w:t>
             </w:r>
           </w:p>
         </w:tc>
@@ -5842,7 +5867,7 @@
           </w:tcPr>
           <w:p>
             <w:r>
-              <w:t xml:space="preserve">Z2YF_AMOUNT</w:t>
+              <w:t xml:space="preserve">ZFCST_AMOUNT</w:t>
             </w:r>
           </w:p>
         </w:tc>
@@ -5888,7 +5913,7 @@
           </w:tcPr>
           <w:p>
             <w:r>
-              <w:t xml:space="preserve">Z2YF_BUD_TYPE</w:t>
+              <w:t xml:space="preserve">ZFCST_BUD_TYPE</w:t>
             </w:r>
           </w:p>
         </w:tc>
@@ -5910,7 +5935,7 @@
           </w:tcPr>
           <w:p>
             <w:r>
-              <w:t xml:space="preserve">Z2YF_BUD_TYPE</w:t>
+              <w:t xml:space="preserve">ZFCST_BUD_TYPE</w:t>
             </w:r>
           </w:p>
         </w:tc>
@@ -5956,7 +5981,7 @@
           </w:tcPr>
           <w:p>
             <w:r>
-              <w:t xml:space="preserve">Z2YF_PROJ_TYPE</w:t>
+              <w:t xml:space="preserve">ZFCST_PROJ_TYPE</w:t>
             </w:r>
           </w:p>
         </w:tc>
@@ -5978,7 +6003,7 @@
           </w:tcPr>
           <w:p>
             <w:r>
-              <w:t xml:space="preserve">Z2YF_PROJ_TYPE</w:t>
+              <w:t xml:space="preserve">ZFCST_PROJ_TYPE</w:t>
             </w:r>
           </w:p>
         </w:tc>
@@ -6024,7 +6049,7 @@
           </w:tcPr>
           <w:p>
             <w:r>
-              <w:t xml:space="preserve">Z2YF_CHANGE_CNT</w:t>
+              <w:t xml:space="preserve">ZFCST_CHANGE_CNT</w:t>
             </w:r>
           </w:p>
         </w:tc>
@@ -6092,7 +6117,7 @@
           </w:tcPr>
           <w:p>
             <w:r>
-              <w:t xml:space="preserve">Z2YF_CHG_IND</w:t>
+              <w:t xml:space="preserve">ZFCST_CHG_IND</w:t>
             </w:r>
           </w:p>
         </w:tc>
@@ -6114,7 +6139,7 @@
           </w:tcPr>
           <w:p>
             <w:r>
-              <w:t xml:space="preserve">Z2YF_CHG_IND</w:t>
+              <w:t xml:space="preserve">ZFCST_CHG_IND</w:t>
             </w:r>
           </w:p>
         </w:tc>
@@ -6160,7 +6185,7 @@
           </w:tcPr>
           <w:p>
             <w:r>
-              <w:t xml:space="preserve">Z2YF_FIELD_TEXT</w:t>
+              <w:t xml:space="preserve">ZFCST_FIELD_TEXT</w:t>
             </w:r>
           </w:p>
         </w:tc>
@@ -6182,7 +6207,7 @@
           </w:tcPr>
           <w:p>
             <w:r>
-              <w:t xml:space="preserve">Z2YF_TEXT100</w:t>
+              <w:t xml:space="preserve">ZFCST_TEXT100</w:t>
             </w:r>
           </w:p>
         </w:tc>
@@ -6228,7 +6253,7 @@
           </w:tcPr>
           <w:p>
             <w:r>
-              <w:t xml:space="preserve">Z2YF_VALUE_OLD</w:t>
+              <w:t xml:space="preserve">ZFCST_VALUE_OLD</w:t>
             </w:r>
           </w:p>
         </w:tc>
@@ -6250,7 +6275,7 @@
           </w:tcPr>
           <w:p>
             <w:r>
-              <w:t xml:space="preserve">Z2YF_TEXT255</w:t>
+              <w:t xml:space="preserve">ZFCST_TEXT255</w:t>
             </w:r>
           </w:p>
         </w:tc>
@@ -6296,7 +6321,7 @@
           </w:tcPr>
           <w:p>
             <w:r>
-              <w:t xml:space="preserve">Z2YF_VALUE_NEW</w:t>
+              <w:t xml:space="preserve">ZFCST_VALUE_NEW</w:t>
             </w:r>
           </w:p>
         </w:tc>
@@ -6318,7 +6343,7 @@
           </w:tcPr>
           <w:p>
             <w:r>
-              <w:t xml:space="preserve">Z2YF_TEXT255</w:t>
+              <w:t xml:space="preserve">ZFCST_TEXT255</w:t>
             </w:r>
           </w:p>
         </w:tc>
@@ -6356,7 +6381,7 @@
         <w:pStyle w:val="Heading2"/>
       </w:pPr>
       <w:r>
-        <w:t xml:space="preserve">6.3 Table ZFI_BUD_2YF_H – Forecast Header</w:t>
+        <w:t xml:space="preserve">6.3 Table ZFI_BUD_FCST_H – Forecast Header</w:t>
       </w:r>
     </w:p>
     <w:p>
@@ -6369,7 +6394,7 @@
         <w:spacing w:after="60"/>
       </w:pPr>
       <w:r>
-        <w:t xml:space="preserve">SE11 → Database table ZFI_BUD_2YF_H → Create; delivery class A; Data Browser/Table View Maint. = Display/Maintenance Allowed with Restrictions.</w:t>
+        <w:t xml:space="preserve">SE11 → Database table ZFI_BUD_FCST_H → Create; delivery class A; Data Browser/Table View Maint. = Display/Maintenance Allowed with Restrictions.</w:t>
       </w:r>
     </w:p>
     <w:p>
@@ -6875,7 +6900,7 @@
           </w:tcPr>
           <w:p>
             <w:r>
-              <w:t xml:space="preserve">Z2YF_YEAR_FROM</w:t>
+              <w:t xml:space="preserve">ZFCST_YEAR_FROM</w:t>
             </w:r>
           </w:p>
         </w:tc>
@@ -6965,7 +6990,7 @@
           </w:tcPr>
           <w:p>
             <w:r>
-              <w:t xml:space="preserve">Z2YF_YEAR_TO</w:t>
+              <w:t xml:space="preserve">ZFCST_YEAR_TO</w:t>
             </w:r>
           </w:p>
         </w:tc>
@@ -7137,7 +7162,7 @@
           </w:tcPr>
           <w:p>
             <w:r>
-              <w:t xml:space="preserve">Z2YF_TOTAL_AMOUNT</w:t>
+              <w:t xml:space="preserve">ZFCST_TOTAL_AMOUNT</w:t>
             </w:r>
           </w:p>
         </w:tc>
@@ -7223,7 +7248,7 @@
           </w:tcPr>
           <w:p>
             <w:r>
-              <w:t xml:space="preserve">Z2YF_CHANGE_CNT</w:t>
+              <w:t xml:space="preserve">ZFCST_CHANGE_CNT</w:t>
             </w:r>
           </w:p>
         </w:tc>
@@ -7441,7 +7466,7 @@
         <w:pStyle w:val="Heading2"/>
       </w:pPr>
       <w:r>
-        <w:t xml:space="preserve">6.4 Table ZFI_BUD_2YF_I – Forecast Items</w:t>
+        <w:t xml:space="preserve">6.4 Table ZFI_BUD_FCST_I – Forecast Items</w:t>
       </w:r>
     </w:p>
     <w:p>
@@ -7454,7 +7479,7 @@
         <w:spacing w:after="60"/>
       </w:pPr>
       <w:r>
-        <w:t xml:space="preserve">SE11 → Database table ZFI_BUD_2YF_I → Create; delivery class A; Data Browser/Table View Maint. = Display/Maintenance Allowed with Restrictions.</w:t>
+        <w:t xml:space="preserve">SE11 → Database table ZFI_BUD_FCST_I → Create; delivery class A; Data Browser/Table View Maint. = Display/Maintenance Allowed with Restrictions.</w:t>
       </w:r>
     </w:p>
     <w:p>
@@ -7780,7 +7805,7 @@
           </w:tcPr>
           <w:p>
             <w:r>
-              <w:t xml:space="preserve">Z2YF_ITEM_NO</w:t>
+              <w:t xml:space="preserve">ZFCST_ITEM_NO</w:t>
             </w:r>
           </w:p>
         </w:tc>
@@ -7866,7 +7891,7 @@
           </w:tcPr>
           <w:p>
             <w:r>
-              <w:t xml:space="preserve">Z2YF_BUDGET_YEAR</w:t>
+              <w:t xml:space="preserve">ZFCST_BUDGET_YEAR</w:t>
             </w:r>
           </w:p>
         </w:tc>
@@ -7952,7 +7977,7 @@
           </w:tcPr>
           <w:p>
             <w:r>
-              <w:t xml:space="preserve">Z2YF_PROJ_NAME</w:t>
+              <w:t xml:space="preserve">ZFCST_PROJ_NAME</w:t>
             </w:r>
           </w:p>
         </w:tc>
@@ -8038,7 +8063,7 @@
           </w:tcPr>
           <w:p>
             <w:r>
-              <w:t xml:space="preserve">Z2YF_PROJ_DESC</w:t>
+              <w:t xml:space="preserve">ZFCST_PROJ_DESC</w:t>
             </w:r>
           </w:p>
         </w:tc>
@@ -8124,7 +8149,7 @@
           </w:tcPr>
           <w:p>
             <w:r>
-              <w:t xml:space="preserve">Z2YF_PRIORITY</w:t>
+              <w:t xml:space="preserve">ZFCST_PRIORITY</w:t>
             </w:r>
           </w:p>
         </w:tc>
@@ -8210,7 +8235,7 @@
           </w:tcPr>
           <w:p>
             <w:r>
-              <w:t xml:space="preserve">Z2YF_AMOUNT</w:t>
+              <w:t xml:space="preserve">ZFCST_AMOUNT</w:t>
             </w:r>
           </w:p>
         </w:tc>
@@ -8378,7 +8403,7 @@
           </w:tcPr>
           <w:p>
             <w:r>
-              <w:t xml:space="preserve">Z2YF_BUD_TYPE</w:t>
+              <w:t xml:space="preserve">ZFCST_BUD_TYPE</w:t>
             </w:r>
           </w:p>
         </w:tc>
@@ -8464,7 +8489,7 @@
           </w:tcPr>
           <w:p>
             <w:r>
-              <w:t xml:space="preserve">Z2YF_PROJ_TYPE</w:t>
+              <w:t xml:space="preserve">ZFCST_PROJ_TYPE</w:t>
             </w:r>
           </w:p>
         </w:tc>
@@ -8502,7 +8527,7 @@
         <w:pStyle w:val="Heading2"/>
       </w:pPr>
       <w:r>
-        <w:t xml:space="preserve">6.5 Table ZFI_BUD_2YF_LOG – Forecast Change Log (new)</w:t>
+        <w:t xml:space="preserve">6.5 Table ZFI_BUD_FCST_LOG – Forecast Change Log (new)</w:t>
       </w:r>
     </w:p>
     <w:p>
@@ -8515,7 +8540,7 @@
         <w:spacing w:after="60"/>
       </w:pPr>
       <w:r>
-        <w:t xml:space="preserve">SE11 → Database table ZFI_BUD_2YF_LOG → Create; delivery class A; Data Browser/Table View Maint. = Display/Maintenance Allowed with Restrictions.</w:t>
+        <w:t xml:space="preserve">SE11 → Database table ZFI_BUD_FCST_LOG → Create; delivery class A; Data Browser/Table View Maint. = Display/Maintenance Allowed with Restrictions.</w:t>
       </w:r>
     </w:p>
     <w:p>
@@ -8841,7 +8866,7 @@
           </w:tcPr>
           <w:p>
             <w:r>
-              <w:t xml:space="preserve">Z2YF_CHANGE_CNT</w:t>
+              <w:t xml:space="preserve">ZFCST_CHANGE_CNT</w:t>
             </w:r>
           </w:p>
         </w:tc>
@@ -8931,7 +8956,7 @@
           </w:tcPr>
           <w:p>
             <w:r>
-              <w:t xml:space="preserve">Z2YF_LOG_NO</w:t>
+              <w:t xml:space="preserve">ZFCST_LOG_NO</w:t>
             </w:r>
           </w:p>
         </w:tc>
@@ -9017,7 +9042,7 @@
           </w:tcPr>
           <w:p>
             <w:r>
-              <w:t xml:space="preserve">Z2YF_ITEM_NO</w:t>
+              <w:t xml:space="preserve">ZFCST_ITEM_NO</w:t>
             </w:r>
           </w:p>
         </w:tc>
@@ -9103,7 +9128,7 @@
           </w:tcPr>
           <w:p>
             <w:r>
-              <w:t xml:space="preserve">Z2YF_CHG_IND</w:t>
+              <w:t xml:space="preserve">ZFCST_CHG_IND</w:t>
             </w:r>
           </w:p>
         </w:tc>
@@ -9275,7 +9300,7 @@
           </w:tcPr>
           <w:p>
             <w:r>
-              <w:t xml:space="preserve">Z2YF_FIELD_TEXT</w:t>
+              <w:t xml:space="preserve">ZFCST_FIELD_TEXT</w:t>
             </w:r>
           </w:p>
         </w:tc>
@@ -9361,7 +9386,7 @@
           </w:tcPr>
           <w:p>
             <w:r>
-              <w:t xml:space="preserve">Z2YF_VALUE_OLD</w:t>
+              <w:t xml:space="preserve">ZFCST_VALUE_OLD</w:t>
             </w:r>
           </w:p>
         </w:tc>
@@ -9447,7 +9472,7 @@
           </w:tcPr>
           <w:p>
             <w:r>
-              <w:t xml:space="preserve">Z2YF_VALUE_NEW</w:t>
+              <w:t xml:space="preserve">ZFCST_VALUE_NEW</w:t>
             </w:r>
           </w:p>
         </w:tc>
@@ -9571,33 +9596,22 @@
         <w:pStyle w:val="Heading1"/>
       </w:pPr>
       <w:r>
-        <w:t xml:space="preserve">7. Step 2 – Message Class ZBUD_2YF (SE91)</w:t>
-      </w:r>
-    </w:p>
-    <w:p>
-      <w:pPr>
-        <w:pStyle w:val="ListParagraph"/>
-        <w:numPr>
-          <w:ilvl w:val="0"/>
-          <w:numId w:val="9"/>
-        </w:numPr>
-        <w:spacing w:after="60"/>
-      </w:pPr>
-      <w:r>
-        <w:t xml:space="preserve">SE91 → Message class ZBUD_2YF → Create, package ZFI.</w:t>
-      </w:r>
-    </w:p>
-    <w:p>
-      <w:pPr>
-        <w:pStyle w:val="ListParagraph"/>
-        <w:numPr>
-          <w:ilvl w:val="0"/>
-          <w:numId w:val="9"/>
-        </w:numPr>
-        <w:spacing w:after="60"/>
-      </w:pPr>
-      <w:r>
-        <w:t xml:space="preserve">Enter the messages below, save.</w:t>
+        <w:t xml:space="preserve">7. Step 2 – Message Class ZBUD_FCST (SE91) – already created</w:t>
+      </w:r>
+    </w:p>
+    <w:p>
+      <w:pPr>
+        <w:spacing w:after="100"/>
+      </w:pPr>
+      <w:r>
+        <w:rPr>
+          <w:b/>
+          <w:bCs/>
+        </w:rPr>
+        <w:t xml:space="preserve">Already created.</w:t>
+      </w:r>
+      <w:r>
+        <w:t xml:space="preserve"> Check that all messages below exist – 027 is used by the change history double-click.</w:t>
       </w:r>
     </w:p>
     <w:tbl>
@@ -10890,7 +10904,7 @@
         <w:pStyle w:val="ListParagraph"/>
         <w:numPr>
           <w:ilvl w:val="0"/>
-          <w:numId w:val="10"/>
+          <w:numId w:val="9"/>
         </w:numPr>
         <w:spacing w:after="60"/>
       </w:pPr>
@@ -10903,7 +10917,7 @@
         <w:pStyle w:val="ListParagraph"/>
         <w:numPr>
           <w:ilvl w:val="0"/>
-          <w:numId w:val="10"/>
+          <w:numId w:val="9"/>
         </w:numPr>
         <w:spacing w:after="60"/>
       </w:pPr>
@@ -10916,7 +10930,7 @@
         <w:pStyle w:val="ListParagraph"/>
         <w:numPr>
           <w:ilvl w:val="0"/>
-          <w:numId w:val="10"/>
+          <w:numId w:val="9"/>
         </w:numPr>
         <w:spacing w:after="60"/>
       </w:pPr>
@@ -10929,7 +10943,7 @@
         <w:pStyle w:val="ListParagraph"/>
         <w:numPr>
           <w:ilvl w:val="0"/>
-          <w:numId w:val="10"/>
+          <w:numId w:val="9"/>
         </w:numPr>
         <w:spacing w:after="60"/>
       </w:pPr>
@@ -10942,7 +10956,7 @@
         <w:pStyle w:val="ListParagraph"/>
         <w:numPr>
           <w:ilvl w:val="0"/>
-          <w:numId w:val="10"/>
+          <w:numId w:val="9"/>
         </w:numPr>
         <w:spacing w:after="60"/>
       </w:pPr>
@@ -10955,7 +10969,7 @@
         <w:pStyle w:val="ListParagraph"/>
         <w:numPr>
           <w:ilvl w:val="0"/>
-          <w:numId w:val="10"/>
+          <w:numId w:val="9"/>
         </w:numPr>
         <w:spacing w:after="60"/>
       </w:pPr>
@@ -11287,12 +11301,54 @@
         <w:pStyle w:val="ListParagraph"/>
         <w:numPr>
           <w:ilvl w:val="0"/>
-          <w:numId w:val="11"/>
+          <w:numId w:val="10"/>
         </w:numPr>
         <w:spacing w:after="60"/>
       </w:pPr>
       <w:r>
         <w:t xml:space="preserve">SE80 → Program ZFI_BUD_2YF_ENTRY → Create without TOP include, type M – Module Pool, package ZFI.</w:t>
+      </w:r>
+    </w:p>
+    <w:p>
+      <w:pPr>
+        <w:pStyle w:val="ListParagraph"/>
+        <w:numPr>
+          <w:ilvl w:val="0"/>
+          <w:numId w:val="10"/>
+        </w:numPr>
+        <w:spacing w:after="60"/>
+      </w:pPr>
+      <w:r>
+        <w:t xml:space="preserve">Paste the main program (Appendix A.11). Create the includes by double-click: ZFI_BUD_2YF_ENTRY_TOP (A.12), ZFI_BUD_2YF_ENTRY_C01 (A.13), ZFI_BUD_2YF_ENTRY_PBO (A.14), ZFI_BUD_2YF_ENTRY_PAI (A.15).</w:t>
+      </w:r>
+    </w:p>
+    <w:p>
+      <w:pPr>
+        <w:pStyle w:val="ListParagraph"/>
+        <w:numPr>
+          <w:ilvl w:val="0"/>
+          <w:numId w:val="10"/>
+        </w:numPr>
+        <w:spacing w:after="60"/>
+      </w:pPr>
+      <w:r>
+        <w:t xml:space="preserve">Do not activate yet – screen and GUI status follow.</w:t>
+      </w:r>
+    </w:p>
+    <w:p>
+      <w:pPr>
+        <w:spacing w:after="100"/>
+      </w:pPr>
+      <w:r>
+        <w:t xml:space="preserve">LCL_SCREEN_0100 is the screen controller: it holds the screen state (mode, status, display only, saved version) and translates user actions into calls of ZCL_FI_BUD_2YF. Every PBO/PAI module is a single method call.</w:t>
+      </w:r>
+    </w:p>
+    <w:p>
+      <w:pPr>
+        <w:pStyle w:val="Heading1"/>
+      </w:pPr>
+      <w:r>
+        <w:t xml:space="preserve">10. Step 5 – Screen 0100 (SE51)</w:t>
       </w:r>
     </w:p>
     <w:p>
@@ -11305,7 +11361,7 @@
         <w:spacing w:after="60"/>
       </w:pPr>
       <w:r>
-        <w:t xml:space="preserve">Paste the main program (Appendix A.11). Create the includes by double-click: ZFI_BUD_2YF_ENTRY_TOP (A.12), ZFI_BUD_2YF_ENTRY_C01 (A.13), ZFI_BUD_2YF_ENTRY_PBO (A.14), ZFI_BUD_2YF_ENTRY_PAI (A.15).</w:t>
+        <w:t xml:space="preserve">SE51 → program ZFI_BUD_2YF_ENTRY, screen 0100 → Create (Normal screen, "Create / Modify Budget Forecast").</w:t>
       </w:r>
     </w:p>
     <w:p>
@@ -11318,23 +11374,7 @@
         <w:spacing w:after="60"/>
       </w:pPr>
       <w:r>
-        <w:t xml:space="preserve">Do not activate yet – screen and GUI status follow.</w:t>
-      </w:r>
-    </w:p>
-    <w:p>
-      <w:pPr>
-        <w:spacing w:after="100"/>
-      </w:pPr>
-      <w:r>
-        <w:t xml:space="preserve">LCL_SCREEN_0100 is the screen controller: it holds the screen state (mode, status, display only, saved version) and translates user actions into calls of ZCL_FI_BUD_2YF. Every PBO/PAI module is a single method call.</w:t>
-      </w:r>
-    </w:p>
-    <w:p>
-      <w:pPr>
-        <w:pStyle w:val="Heading1"/>
-      </w:pPr>
-      <w:r>
-        <w:t xml:space="preserve">10. Step 5 – Screen 0100 (SE51)</w:t>
+        <w:t xml:space="preserve">Utilities → More Utilities → Upload → 01_NEW_OBJECTS/screens/ZFI_BUD_2YF_ENTRY_0100.txt. Check, save, activate.</w:t>
       </w:r>
     </w:p>
     <w:p>
@@ -11342,33 +11382,7 @@
         <w:pStyle w:val="ListParagraph"/>
         <w:numPr>
           <w:ilvl w:val="0"/>
-          <w:numId w:val="12"/>
-        </w:numPr>
-        <w:spacing w:after="60"/>
-      </w:pPr>
-      <w:r>
-        <w:t xml:space="preserve">SE51 → program ZFI_BUD_2YF_ENTRY, screen 0100 → Create (Normal screen, "Create / Modify Budget Forecast").</w:t>
-      </w:r>
-    </w:p>
-    <w:p>
-      <w:pPr>
-        <w:pStyle w:val="ListParagraph"/>
-        <w:numPr>
-          <w:ilvl w:val="0"/>
-          <w:numId w:val="12"/>
-        </w:numPr>
-        <w:spacing w:after="60"/>
-      </w:pPr>
-      <w:r>
-        <w:t xml:space="preserve">Utilities → More Utilities → Upload → 01_NEW_OBJECTS/screens/ZFI_BUD_2YF_ENTRY_0100.txt. Check, save, activate.</w:t>
-      </w:r>
-    </w:p>
-    <w:p>
-      <w:pPr>
-        <w:pStyle w:val="ListParagraph"/>
-        <w:numPr>
-          <w:ilvl w:val="0"/>
-          <w:numId w:val="12"/>
+          <w:numId w:val="11"/>
         </w:numPr>
         <w:spacing w:after="60"/>
       </w:pPr>
@@ -12354,12 +12368,59 @@
         <w:pStyle w:val="ListParagraph"/>
         <w:numPr>
           <w:ilvl w:val="0"/>
-          <w:numId w:val="13"/>
+          <w:numId w:val="12"/>
         </w:numPr>
         <w:spacing w:after="60"/>
       </w:pPr>
       <w:r>
         <w:t xml:space="preserve">Status GUI_0100 (dialog status): ENTER (green check), SAVE (Ctrl+S), BACK (F3), EXIT (Shift+F3), CANCEL (F12).</w:t>
+      </w:r>
+    </w:p>
+    <w:p>
+      <w:pPr>
+        <w:pStyle w:val="ListParagraph"/>
+        <w:numPr>
+          <w:ilvl w:val="0"/>
+          <w:numId w:val="12"/>
+        </w:numPr>
+        <w:spacing w:after="60"/>
+      </w:pPr>
+      <w:r>
+        <w:t xml:space="preserve">BACK, EXIT, CANCEL: Functional type E (Exit command).</w:t>
+      </w:r>
+    </w:p>
+    <w:p>
+      <w:pPr>
+        <w:pStyle w:val="ListParagraph"/>
+        <w:numPr>
+          <w:ilvl w:val="0"/>
+          <w:numId w:val="12"/>
+        </w:numPr>
+        <w:spacing w:after="60"/>
+      </w:pPr>
+      <w:r>
+        <w:t xml:space="preserve">Title TITLE_0100: "&amp;1 Budget Forecast".</w:t>
+      </w:r>
+    </w:p>
+    <w:p>
+      <w:pPr>
+        <w:pStyle w:val="ListParagraph"/>
+        <w:numPr>
+          <w:ilvl w:val="0"/>
+          <w:numId w:val="12"/>
+        </w:numPr>
+        <w:spacing w:after="60"/>
+      </w:pPr>
+      <w:r>
+        <w:t xml:space="preserve">Activate the whole program ZFI_BUD_2YF_ENTRY.</w:t>
+      </w:r>
+    </w:p>
+    <w:p>
+      <w:pPr>
+        <w:pStyle w:val="Heading1"/>
+      </w:pPr>
+      <w:r>
+        <w:t xml:space="preserve">12. Step 7 – Report ZFI_BUD_2YF_REPORT</w:t>
       </w:r>
     </w:p>
     <w:p>
@@ -12372,7 +12433,7 @@
         <w:spacing w:after="60"/>
       </w:pPr>
       <w:r>
-        <w:t xml:space="preserve">BACK, EXIT, CANCEL: Functional type E (Exit command).</w:t>
+        <w:t xml:space="preserve">SE38 → ZFI_BUD_2YF_REPORT → Create, type 1 Executable program, package ZFI. Paste Appendix A.16.</w:t>
       </w:r>
     </w:p>
     <w:p>
@@ -12385,7 +12446,7 @@
         <w:spacing w:after="60"/>
       </w:pPr>
       <w:r>
-        <w:t xml:space="preserve">Title TITLE_0100: "&amp;1 Budget Forecast".</w:t>
+        <w:t xml:space="preserve">Text symbols: B01 = Selection, B02 = Output.</w:t>
       </w:r>
     </w:p>
     <w:p>
@@ -12398,15 +12459,7 @@
         <w:spacing w:after="60"/>
       </w:pPr>
       <w:r>
-        <w:t xml:space="preserve">Activate the whole program ZFI_BUD_2YF_ENTRY.</w:t>
-      </w:r>
-    </w:p>
-    <w:p>
-      <w:pPr>
-        <w:pStyle w:val="Heading1"/>
-      </w:pPr>
-      <w:r>
-        <w:t xml:space="preserve">12. Step 7 – Report ZFI_BUD_2YF_REPORT</w:t>
+        <w:t xml:space="preserve">Selection texts: S_BUKRS, S_KOSTL, S_FYEAR, S_ERNAM → Dictionary Ref.; P_XLSX = Download directly to Excel (.xlsx).</w:t>
       </w:r>
     </w:p>
     <w:p>
@@ -12414,46 +12467,7 @@
         <w:pStyle w:val="ListParagraph"/>
         <w:numPr>
           <w:ilvl w:val="0"/>
-          <w:numId w:val="14"/>
-        </w:numPr>
-        <w:spacing w:after="60"/>
-      </w:pPr>
-      <w:r>
-        <w:t xml:space="preserve">SE38 → ZFI_BUD_2YF_REPORT → Create, type 1 Executable program, package ZFI. Paste Appendix A.16.</w:t>
-      </w:r>
-    </w:p>
-    <w:p>
-      <w:pPr>
-        <w:pStyle w:val="ListParagraph"/>
-        <w:numPr>
-          <w:ilvl w:val="0"/>
-          <w:numId w:val="14"/>
-        </w:numPr>
-        <w:spacing w:after="60"/>
-      </w:pPr>
-      <w:r>
-        <w:t xml:space="preserve">Text symbols: B01 = Selection, B02 = Output.</w:t>
-      </w:r>
-    </w:p>
-    <w:p>
-      <w:pPr>
-        <w:pStyle w:val="ListParagraph"/>
-        <w:numPr>
-          <w:ilvl w:val="0"/>
-          <w:numId w:val="14"/>
-        </w:numPr>
-        <w:spacing w:after="60"/>
-      </w:pPr>
-      <w:r>
-        <w:t xml:space="preserve">Selection texts: S_BUKRS, S_KOSTL, S_FYEAR, S_ERNAM → Dictionary Ref.; P_XLSX = Download directly to Excel (.xlsx).</w:t>
-      </w:r>
-    </w:p>
-    <w:p>
-      <w:pPr>
-        <w:pStyle w:val="ListParagraph"/>
-        <w:numPr>
-          <w:ilvl w:val="0"/>
-          <w:numId w:val="14"/>
+          <w:numId w:val="13"/>
         </w:numPr>
         <w:spacing w:after="60"/>
       </w:pPr>
@@ -12897,7 +12911,7 @@
         <w:pStyle w:val="ListParagraph"/>
         <w:numPr>
           <w:ilvl w:val="0"/>
-          <w:numId w:val="15"/>
+          <w:numId w:val="14"/>
         </w:numPr>
         <w:spacing w:after="60"/>
       </w:pPr>
@@ -12910,7 +12924,7 @@
         <w:pStyle w:val="ListParagraph"/>
         <w:numPr>
           <w:ilvl w:val="0"/>
-          <w:numId w:val="15"/>
+          <w:numId w:val="14"/>
         </w:numPr>
         <w:spacing w:after="60"/>
       </w:pPr>
@@ -12923,7 +12937,7 @@
         <w:pStyle w:val="ListParagraph"/>
         <w:numPr>
           <w:ilvl w:val="0"/>
-          <w:numId w:val="15"/>
+          <w:numId w:val="14"/>
         </w:numPr>
         <w:spacing w:after="60"/>
       </w:pPr>
@@ -14077,7 +14091,7 @@
         <w:pStyle w:val="ListParagraph"/>
         <w:numPr>
           <w:ilvl w:val="0"/>
-          <w:numId w:val="16"/>
+          <w:numId w:val="15"/>
         </w:numPr>
         <w:spacing w:after="60"/>
       </w:pPr>
@@ -14090,7 +14104,7 @@
         <w:pStyle w:val="ListParagraph"/>
         <w:numPr>
           <w:ilvl w:val="0"/>
-          <w:numId w:val="16"/>
+          <w:numId w:val="15"/>
         </w:numPr>
         <w:spacing w:after="60"/>
       </w:pPr>
@@ -14103,7 +14117,7 @@
         <w:pStyle w:val="ListParagraph"/>
         <w:numPr>
           <w:ilvl w:val="0"/>
-          <w:numId w:val="16"/>
+          <w:numId w:val="15"/>
         </w:numPr>
         <w:spacing w:after="60"/>
       </w:pPr>
@@ -14116,7 +14130,7 @@
         <w:pStyle w:val="ListParagraph"/>
         <w:numPr>
           <w:ilvl w:val="0"/>
-          <w:numId w:val="16"/>
+          <w:numId w:val="15"/>
         </w:numPr>
         <w:spacing w:after="60"/>
       </w:pPr>
@@ -15504,21 +15518,21 @@
           <w:sz w:val="15"/>
           <w:szCs w:val="15"/>
         </w:rPr>
-        <w:t xml:space="preserve">  TYPES ty_header TYPE zfi_bud_2yf_h.</w:t>
-      </w:r>
-    </w:p>
-    <w:p>
-      <w:pPr>
-        <w:shd w:fill="F2F2F2" w:color="auto" w:val="clear"/>
-        <w:spacing w:after="0" w:line="228"/>
-      </w:pPr>
-      <w:r>
-        <w:rPr>
-          <w:rFonts w:ascii="Courier New" w:cs="Courier New" w:eastAsia="Courier New" w:hAnsi="Courier New"/>
-          <w:sz w:val="15"/>
-          <w:szCs w:val="15"/>
-        </w:rPr>
-        <w:t xml:space="preserve">  TYPES ty_item   TYPE zfi_bud_2yf_i.</w:t>
+        <w:t xml:space="preserve">  TYPES ty_header TYPE zfi_bud_fcst_h.</w:t>
+      </w:r>
+    </w:p>
+    <w:p>
+      <w:pPr>
+        <w:shd w:fill="F2F2F2" w:color="auto" w:val="clear"/>
+        <w:spacing w:after="0" w:line="228"/>
+      </w:pPr>
+      <w:r>
+        <w:rPr>
+          <w:rFonts w:ascii="Courier New" w:cs="Courier New" w:eastAsia="Courier New" w:hAnsi="Courier New"/>
+          <w:sz w:val="15"/>
+          <w:szCs w:val="15"/>
+        </w:rPr>
+        <w:t xml:space="preserve">  TYPES ty_item   TYPE zfi_bud_fcst_i.</w:t>
       </w:r>
     </w:p>
     <w:p>
@@ -15546,7 +15560,7 @@
           <w:sz w:val="15"/>
           <w:szCs w:val="15"/>
         </w:rPr>
-        <w:t xml:space="preserve">  TYPES ty_log    TYPE zfi_bud_2yf_log.</w:t>
+        <w:t xml:space="preserve">  TYPES ty_log    TYPE zfi_bud_fcst_log.</w:t>
       </w:r>
     </w:p>
     <w:p>
@@ -15658,21 +15672,21 @@
           <w:sz w:val="15"/>
           <w:szCs w:val="15"/>
         </w:rPr>
-        <w:t xml:space="preserve">           fyear_from TYPE z2yf_year_from,</w:t>
-      </w:r>
-    </w:p>
-    <w:p>
-      <w:pPr>
-        <w:shd w:fill="F2F2F2" w:color="auto" w:val="clear"/>
-        <w:spacing w:after="0" w:line="228"/>
-      </w:pPr>
-      <w:r>
-        <w:rPr>
-          <w:rFonts w:ascii="Courier New" w:cs="Courier New" w:eastAsia="Courier New" w:hAnsi="Courier New"/>
-          <w:sz w:val="15"/>
-          <w:szCs w:val="15"/>
-        </w:rPr>
-        <w:t xml:space="preserve">           fyear_to   TYPE z2yf_year_to,</w:t>
+        <w:t xml:space="preserve">           fyear_from TYPE zfcst_year_from,</w:t>
+      </w:r>
+    </w:p>
+    <w:p>
+      <w:pPr>
+        <w:shd w:fill="F2F2F2" w:color="auto" w:val="clear"/>
+        <w:spacing w:after="0" w:line="228"/>
+      </w:pPr>
+      <w:r>
+        <w:rPr>
+          <w:rFonts w:ascii="Courier New" w:cs="Courier New" w:eastAsia="Courier New" w:hAnsi="Courier New"/>
+          <w:sz w:val="15"/>
+          <w:szCs w:val="15"/>
+        </w:rPr>
+        <w:t xml:space="preserve">           fyear_to   TYPE zfcst_year_to,</w:t>
       </w:r>
     </w:p>
     <w:p>
@@ -15728,21 +15742,21 @@
           <w:sz w:val="15"/>
           <w:szCs w:val="15"/>
         </w:rPr>
-        <w:t xml:space="preserve">           fyear_from TYPE z2yf_year_from,</w:t>
-      </w:r>
-    </w:p>
-    <w:p>
-      <w:pPr>
-        <w:shd w:fill="F2F2F2" w:color="auto" w:val="clear"/>
-        <w:spacing w:after="0" w:line="228"/>
-      </w:pPr>
-      <w:r>
-        <w:rPr>
-          <w:rFonts w:ascii="Courier New" w:cs="Courier New" w:eastAsia="Courier New" w:hAnsi="Courier New"/>
-          <w:sz w:val="15"/>
-          <w:szCs w:val="15"/>
-        </w:rPr>
-        <w:t xml:space="preserve">           fyear_to   TYPE z2yf_year_to,</w:t>
+        <w:t xml:space="preserve">           fyear_from TYPE zfcst_year_from,</w:t>
+      </w:r>
+    </w:p>
+    <w:p>
+      <w:pPr>
+        <w:shd w:fill="F2F2F2" w:color="auto" w:val="clear"/>
+        <w:spacing w:after="0" w:line="228"/>
+      </w:pPr>
+      <w:r>
+        <w:rPr>
+          <w:rFonts w:ascii="Courier New" w:cs="Courier New" w:eastAsia="Courier New" w:hAnsi="Courier New"/>
+          <w:sz w:val="15"/>
+          <w:szCs w:val="15"/>
+        </w:rPr>
+        <w:t xml:space="preserve">           fyear_to   TYPE zfcst_year_to,</w:t>
       </w:r>
     </w:p>
     <w:p>
@@ -15966,7 +15980,7 @@
           <w:sz w:val="15"/>
           <w:szCs w:val="15"/>
         </w:rPr>
-        <w:t xml:space="preserve">  CONSTANTS c_msgid TYPE symsgid VALUE 'ZBUD_2YF'.</w:t>
+        <w:t xml:space="preserve">  CONSTANTS c_msgid TYPE symsgid VALUE 'ZBUD_FCST'.</w:t>
       </w:r>
     </w:p>
     <w:p>
@@ -16274,35 +16288,35 @@
           <w:sz w:val="15"/>
           <w:szCs w:val="15"/>
         </w:rPr>
-        <w:t xml:space="preserve">               insert TYPE z2yf_chg_ind VALUE 'I',</w:t>
-      </w:r>
-    </w:p>
-    <w:p>
-      <w:pPr>
-        <w:shd w:fill="F2F2F2" w:color="auto" w:val="clear"/>
-        <w:spacing w:after="0" w:line="228"/>
-      </w:pPr>
-      <w:r>
-        <w:rPr>
-          <w:rFonts w:ascii="Courier New" w:cs="Courier New" w:eastAsia="Courier New" w:hAnsi="Courier New"/>
-          <w:sz w:val="15"/>
-          <w:szCs w:val="15"/>
-        </w:rPr>
-        <w:t xml:space="preserve">               update TYPE z2yf_chg_ind VALUE 'U',</w:t>
-      </w:r>
-    </w:p>
-    <w:p>
-      <w:pPr>
-        <w:shd w:fill="F2F2F2" w:color="auto" w:val="clear"/>
-        <w:spacing w:after="0" w:line="228"/>
-      </w:pPr>
-      <w:r>
-        <w:rPr>
-          <w:rFonts w:ascii="Courier New" w:cs="Courier New" w:eastAsia="Courier New" w:hAnsi="Courier New"/>
-          <w:sz w:val="15"/>
-          <w:szCs w:val="15"/>
-        </w:rPr>
-        <w:t xml:space="preserve">               delete TYPE z2yf_chg_ind VALUE 'D',</w:t>
+        <w:t xml:space="preserve">               insert TYPE zfcst_chg_ind VALUE 'I',</w:t>
+      </w:r>
+    </w:p>
+    <w:p>
+      <w:pPr>
+        <w:shd w:fill="F2F2F2" w:color="auto" w:val="clear"/>
+        <w:spacing w:after="0" w:line="228"/>
+      </w:pPr>
+      <w:r>
+        <w:rPr>
+          <w:rFonts w:ascii="Courier New" w:cs="Courier New" w:eastAsia="Courier New" w:hAnsi="Courier New"/>
+          <w:sz w:val="15"/>
+          <w:szCs w:val="15"/>
+        </w:rPr>
+        <w:t xml:space="preserve">               update TYPE zfcst_chg_ind VALUE 'U',</w:t>
+      </w:r>
+    </w:p>
+    <w:p>
+      <w:pPr>
+        <w:shd w:fill="F2F2F2" w:color="auto" w:val="clear"/>
+        <w:spacing w:after="0" w:line="228"/>
+      </w:pPr>
+      <w:r>
+        <w:rPr>
+          <w:rFonts w:ascii="Courier New" w:cs="Courier New" w:eastAsia="Courier New" w:hAnsi="Courier New"/>
+          <w:sz w:val="15"/>
+          <w:szCs w:val="15"/>
+        </w:rPr>
+        <w:t xml:space="preserve">               delete TYPE zfcst_chg_ind VALUE 'D',</w:t>
       </w:r>
     </w:p>
     <w:p>
@@ -16455,21 +16469,21 @@
           <w:sz w:val="15"/>
           <w:szCs w:val="15"/>
         </w:rPr>
-        <w:t xml:space="preserve">"! &lt;p class="shorttext synchronized"&gt;Budget Forecast - exception (messages of class ZBUD_2YF)&lt;/p&gt;</w:t>
-      </w:r>
-    </w:p>
-    <w:p>
-      <w:pPr>
-        <w:shd w:fill="F2F2F2" w:color="auto" w:val="clear"/>
-        <w:spacing w:after="0" w:line="228"/>
-      </w:pPr>
-      <w:r>
-        <w:rPr>
-          <w:rFonts w:ascii="Courier New" w:cs="Courier New" w:eastAsia="Courier New" w:hAnsi="Courier New"/>
-          <w:sz w:val="15"/>
-          <w:szCs w:val="15"/>
-        </w:rPr>
-        <w:t xml:space="preserve">"! Raised with RAISE EXCEPTION TYPE zcx_fi_bud_2yf MESSAGE eNNN(zbud_2yf) WITH ...</w:t>
+        <w:t xml:space="preserve">"! &lt;p class="shorttext synchronized"&gt;Budget Forecast - exception (messages of class ZBUD_FCST)&lt;/p&gt;</w:t>
+      </w:r>
+    </w:p>
+    <w:p>
+      <w:pPr>
+        <w:shd w:fill="F2F2F2" w:color="auto" w:val="clear"/>
+        <w:spacing w:after="0" w:line="228"/>
+      </w:pPr>
+      <w:r>
+        <w:rPr>
+          <w:rFonts w:ascii="Courier New" w:cs="Courier New" w:eastAsia="Courier New" w:hAnsi="Courier New"/>
+          <w:sz w:val="15"/>
+          <w:szCs w:val="15"/>
+        </w:rPr>
+        <w:t xml:space="preserve">"! Raised with RAISE EXCEPTION TYPE zcx_fi_bud_2yf MESSAGE eNNN(zbud_fcst) WITH ...</w:t>
       </w:r>
     </w:p>
     <w:p>
@@ -17980,7 +17994,7 @@
           <w:sz w:val="15"/>
           <w:szCs w:val="15"/>
         </w:rPr>
-        <w:t xml:space="preserve">              iv_old_change_count TYPE z2yf_change_cnt</w:t>
+        <w:t xml:space="preserve">              iv_old_change_count TYPE zfcst_change_cnt</w:t>
       </w:r>
     </w:p>
     <w:p>
@@ -18817,21 +18831,21 @@
           <w:sz w:val="15"/>
           <w:szCs w:val="15"/>
         </w:rPr>
-        <w:t xml:space="preserve">      IMPORTING iv_from        TYPE z2yf_year_from</w:t>
-      </w:r>
-    </w:p>
-    <w:p>
-      <w:pPr>
-        <w:shd w:fill="F2F2F2" w:color="auto" w:val="clear"/>
-        <w:spacing w:after="0" w:line="228"/>
-      </w:pPr>
-      <w:r>
-        <w:rPr>
-          <w:rFonts w:ascii="Courier New" w:cs="Courier New" w:eastAsia="Courier New" w:hAnsi="Courier New"/>
-          <w:sz w:val="15"/>
-          <w:szCs w:val="15"/>
-        </w:rPr>
-        <w:t xml:space="preserve">                iv_to          TYPE z2yf_year_to</w:t>
+        <w:t xml:space="preserve">      IMPORTING iv_from        TYPE zfcst_year_from</w:t>
+      </w:r>
+    </w:p>
+    <w:p>
+      <w:pPr>
+        <w:shd w:fill="F2F2F2" w:color="auto" w:val="clear"/>
+        <w:spacing w:after="0" w:line="228"/>
+      </w:pPr>
+      <w:r>
+        <w:rPr>
+          <w:rFonts w:ascii="Courier New" w:cs="Courier New" w:eastAsia="Courier New" w:hAnsi="Courier New"/>
+          <w:sz w:val="15"/>
+          <w:szCs w:val="15"/>
+        </w:rPr>
+        <w:t xml:space="preserve">                iv_to          TYPE zfcst_year_to</w:t>
       </w:r>
     </w:p>
     <w:p>
@@ -19657,7 +19671,7 @@
           <w:sz w:val="15"/>
           <w:szCs w:val="15"/>
         </w:rPr>
-        <w:t xml:space="preserve">      FROM zfi_bud_2yf_h</w:t>
+        <w:t xml:space="preserve">      FROM zfi_bud_fcst_h</w:t>
       </w:r>
     </w:p>
     <w:p>
@@ -19797,7 +19811,7 @@
           <w:sz w:val="15"/>
           <w:szCs w:val="15"/>
         </w:rPr>
-        <w:t xml:space="preserve">        MESSAGE e007(zbud_2yf) WITH is_key-bukrs is_key-kostl lv_years.</w:t>
+        <w:t xml:space="preserve">        MESSAGE e007(zbud_fcst) WITH is_key-bukrs is_key-kostl lv_years.</w:t>
       </w:r>
     </w:p>
     <w:p>
@@ -19895,7 +19909,7 @@
           <w:sz w:val="15"/>
           <w:szCs w:val="15"/>
         </w:rPr>
-        <w:t xml:space="preserve">      FROM zfi_bud_2yf_h</w:t>
+        <w:t xml:space="preserve">      FROM zfi_bud_fcst_h</w:t>
       </w:r>
     </w:p>
     <w:p>
@@ -20049,7 +20063,7 @@
           <w:sz w:val="15"/>
           <w:szCs w:val="15"/>
         </w:rPr>
-        <w:t xml:space="preserve">      FROM zfi_bud_2yf_i</w:t>
+        <w:t xml:space="preserve">      FROM zfi_bud_fcst_i</w:t>
       </w:r>
     </w:p>
     <w:p>
@@ -20217,7 +20231,7 @@
           <w:sz w:val="15"/>
           <w:szCs w:val="15"/>
         </w:rPr>
-        <w:t xml:space="preserve">      FROM zfi_bud_2yf_log</w:t>
+        <w:t xml:space="preserve">      FROM zfi_bud_fcst_log</w:t>
       </w:r>
     </w:p>
     <w:p>
@@ -20385,7 +20399,7 @@
           <w:sz w:val="15"/>
           <w:szCs w:val="15"/>
         </w:rPr>
-        <w:t xml:space="preserve">      FROM zfi_bud_2yf_h</w:t>
+        <w:t xml:space="preserve">      FROM zfi_bud_fcst_h</w:t>
       </w:r>
     </w:p>
     <w:p>
@@ -20511,7 +20525,7 @@
           <w:sz w:val="15"/>
           <w:szCs w:val="15"/>
         </w:rPr>
-        <w:t xml:space="preserve">      FROM zfi_bud_2yf_h</w:t>
+        <w:t xml:space="preserve">      FROM zfi_bud_fcst_h</w:t>
       </w:r>
     </w:p>
     <w:p>
@@ -20637,7 +20651,7 @@
           <w:sz w:val="15"/>
           <w:szCs w:val="15"/>
         </w:rPr>
-        <w:t xml:space="preserve">    INSERT zfi_bud_2yf_h FROM @is_header.</w:t>
+        <w:t xml:space="preserve">    INSERT zfi_bud_fcst_h FROM @is_header.</w:t>
       </w:r>
     </w:p>
     <w:p>
@@ -20707,7 +20721,7 @@
           <w:sz w:val="15"/>
           <w:szCs w:val="15"/>
         </w:rPr>
-        <w:t xml:space="preserve">        MESSAGE e006(zbud_2yf) WITH is_header-bukrs is_header-kostl lv_years lv_creator.</w:t>
+        <w:t xml:space="preserve">        MESSAGE e006(zbud_fcst) WITH is_header-bukrs is_header-kostl lv_years lv_creator.</w:t>
       </w:r>
     </w:p>
     <w:p>
@@ -20749,7 +20763,7 @@
           <w:sz w:val="15"/>
           <w:szCs w:val="15"/>
         </w:rPr>
-        <w:t xml:space="preserve">    INSERT zfi_bud_2yf_i FROM TABLE @it_items ACCEPTING DUPLICATE KEYS.</w:t>
+        <w:t xml:space="preserve">    INSERT zfi_bud_fcst_i FROM TABLE @it_items ACCEPTING DUPLICATE KEYS.</w:t>
       </w:r>
     </w:p>
     <w:p>
@@ -20777,7 +20791,7 @@
           <w:sz w:val="15"/>
           <w:szCs w:val="15"/>
         </w:rPr>
-        <w:t xml:space="preserve">      RAISE EXCEPTION TYPE zcx_fi_bud_2yf MESSAGE e016(zbud_2yf).</w:t>
+        <w:t xml:space="preserve">      RAISE EXCEPTION TYPE zcx_fi_bud_2yf MESSAGE e016(zbud_fcst).</w:t>
       </w:r>
     </w:p>
     <w:p>
@@ -20875,7 +20889,7 @@
           <w:sz w:val="15"/>
           <w:szCs w:val="15"/>
         </w:rPr>
-        <w:t xml:space="preserve">    UPDATE zfi_bud_2yf_h</w:t>
+        <w:t xml:space="preserve">    UPDATE zfi_bud_fcst_h</w:t>
       </w:r>
     </w:p>
     <w:p>
@@ -21043,7 +21057,7 @@
           <w:sz w:val="15"/>
           <w:szCs w:val="15"/>
         </w:rPr>
-        <w:t xml:space="preserve">      RAISE EXCEPTION TYPE zcx_fi_bud_2yf MESSAGE e015(zbud_2yf).</w:t>
+        <w:t xml:space="preserve">      RAISE EXCEPTION TYPE zcx_fi_bud_2yf MESSAGE e015(zbud_fcst).</w:t>
       </w:r>
     </w:p>
     <w:p>
@@ -21085,7 +21099,7 @@
           <w:sz w:val="15"/>
           <w:szCs w:val="15"/>
         </w:rPr>
-        <w:t xml:space="preserve">    DELETE FROM zfi_bud_2yf_i</w:t>
+        <w:t xml:space="preserve">    DELETE FROM zfi_bud_fcst_i</w:t>
       </w:r>
     </w:p>
     <w:p>
@@ -21169,7 +21183,7 @@
           <w:sz w:val="15"/>
           <w:szCs w:val="15"/>
         </w:rPr>
-        <w:t xml:space="preserve">    INSERT zfi_bud_2yf_i FROM TABLE @it_items ACCEPTING DUPLICATE KEYS.</w:t>
+        <w:t xml:space="preserve">    INSERT zfi_bud_fcst_i FROM TABLE @it_items ACCEPTING DUPLICATE KEYS.</w:t>
       </w:r>
     </w:p>
     <w:p>
@@ -21197,7 +21211,7 @@
           <w:sz w:val="15"/>
           <w:szCs w:val="15"/>
         </w:rPr>
-        <w:t xml:space="preserve">      RAISE EXCEPTION TYPE zcx_fi_bud_2yf MESSAGE e016(zbud_2yf).</w:t>
+        <w:t xml:space="preserve">      RAISE EXCEPTION TYPE zcx_fi_bud_2yf MESSAGE e016(zbud_fcst).</w:t>
       </w:r>
     </w:p>
     <w:p>
@@ -21253,7 +21267,7 @@
           <w:sz w:val="15"/>
           <w:szCs w:val="15"/>
         </w:rPr>
-        <w:t xml:space="preserve">      INSERT zfi_bud_2yf_log FROM TABLE @it_log ACCEPTING DUPLICATE KEYS.</w:t>
+        <w:t xml:space="preserve">      INSERT zfi_bud_fcst_log FROM TABLE @it_log ACCEPTING DUPLICATE KEYS.</w:t>
       </w:r>
     </w:p>
     <w:p>
@@ -21281,7 +21295,7 @@
           <w:sz w:val="15"/>
           <w:szCs w:val="15"/>
         </w:rPr>
-        <w:t xml:space="preserve">        RAISE EXCEPTION TYPE zcx_fi_bud_2yf MESSAGE e016(zbud_2yf).</w:t>
+        <w:t xml:space="preserve">        RAISE EXCEPTION TYPE zcx_fi_bud_2yf MESSAGE e016(zbud_fcst).</w:t>
       </w:r>
     </w:p>
     <w:p>
@@ -21658,7 +21672,7 @@
           <w:sz w:val="15"/>
           <w:szCs w:val="15"/>
         </w:rPr>
-        <w:t xml:space="preserve">"!   - every change writes a field level change log (ZFI_BUD_2YF_LOG)</w:t>
+        <w:t xml:space="preserve">"!   - every change writes a field level change log (ZFI_BUD_FCST_LOG)</w:t>
       </w:r>
     </w:p>
     <w:p>
@@ -22106,21 +22120,21 @@
           <w:sz w:val="15"/>
           <w:szCs w:val="15"/>
         </w:rPr>
-        <w:t xml:space="preserve">      IMPORTING iv_from        TYPE z2yf_year_from</w:t>
-      </w:r>
-    </w:p>
-    <w:p>
-      <w:pPr>
-        <w:shd w:fill="F2F2F2" w:color="auto" w:val="clear"/>
-        <w:spacing w:after="0" w:line="228"/>
-      </w:pPr>
-      <w:r>
-        <w:rPr>
-          <w:rFonts w:ascii="Courier New" w:cs="Courier New" w:eastAsia="Courier New" w:hAnsi="Courier New"/>
-          <w:sz w:val="15"/>
-          <w:szCs w:val="15"/>
-        </w:rPr>
-        <w:t xml:space="preserve">                iv_to          TYPE z2yf_year_to</w:t>
+        <w:t xml:space="preserve">      IMPORTING iv_from        TYPE zfcst_year_from</w:t>
+      </w:r>
+    </w:p>
+    <w:p>
+      <w:pPr>
+        <w:shd w:fill="F2F2F2" w:color="auto" w:val="clear"/>
+        <w:spacing w:after="0" w:line="228"/>
+      </w:pPr>
+      <w:r>
+        <w:rPr>
+          <w:rFonts w:ascii="Courier New" w:cs="Courier New" w:eastAsia="Courier New" w:hAnsi="Courier New"/>
+          <w:sz w:val="15"/>
+          <w:szCs w:val="15"/>
+        </w:rPr>
+        <w:t xml:space="preserve">                iv_to          TYPE zfcst_year_to</w:t>
       </w:r>
     </w:p>
     <w:p>
@@ -23198,7 +23212,7 @@
           <w:sz w:val="15"/>
           <w:szCs w:val="15"/>
         </w:rPr>
-        <w:t xml:space="preserve">      RETURNING VALUE(rv_total) TYPE z2yf_amount.</w:t>
+        <w:t xml:space="preserve">      RETURNING VALUE(rv_total) TYPE zfcst_amount.</w:t>
       </w:r>
     </w:p>
     <w:p>
@@ -24052,7 +24066,7 @@
           <w:sz w:val="15"/>
           <w:szCs w:val="15"/>
         </w:rPr>
-        <w:t xml:space="preserve">      RAISE EXCEPTION TYPE zcx_fi_bud_2yf MESSAGE e003(zbud_2yf).</w:t>
+        <w:t xml:space="preserve">      RAISE EXCEPTION TYPE zcx_fi_bud_2yf MESSAGE e003(zbud_fcst).</w:t>
       </w:r>
     </w:p>
     <w:p>
@@ -24542,7 +24556,7 @@
           <w:sz w:val="15"/>
           <w:szCs w:val="15"/>
         </w:rPr>
-        <w:t xml:space="preserve">      RAISE EXCEPTION TYPE zcx_fi_bud_2yf MESSAGE e001(zbud_2yf) WITH is_key-bukrs.</w:t>
+        <w:t xml:space="preserve">      RAISE EXCEPTION TYPE zcx_fi_bud_2yf MESSAGE e001(zbud_fcst) WITH is_key-bukrs.</w:t>
       </w:r>
     </w:p>
     <w:p>
@@ -24640,7 +24654,7 @@
           <w:sz w:val="15"/>
           <w:szCs w:val="15"/>
         </w:rPr>
-        <w:t xml:space="preserve">      RAISE EXCEPTION TYPE zcx_fi_bud_2yf MESSAGE e002(zbud_2yf) WITH is_key-kostl lv_kokrs.</w:t>
+        <w:t xml:space="preserve">      RAISE EXCEPTION TYPE zcx_fi_bud_2yf MESSAGE e002(zbud_fcst) WITH is_key-kostl lv_kokrs.</w:t>
       </w:r>
     </w:p>
     <w:p>
@@ -24794,7 +24808,7 @@
           <w:sz w:val="15"/>
           <w:szCs w:val="15"/>
         </w:rPr>
-        <w:t xml:space="preserve">          RAISE EXCEPTION TYPE zcx_fi_bud_2yf MESSAGE e004(zbud_2yf) WITH lv_window.</w:t>
+        <w:t xml:space="preserve">          RAISE EXCEPTION TYPE zcx_fi_bud_2yf MESSAGE e004(zbud_fcst) WITH lv_window.</w:t>
       </w:r>
     </w:p>
     <w:p>
@@ -24850,7 +24864,7 @@
           <w:sz w:val="15"/>
           <w:szCs w:val="15"/>
         </w:rPr>
-        <w:t xml:space="preserve">          RAISE EXCEPTION TYPE zcx_fi_bud_2yf MESSAGE e005(zbud_2yf) WITH is_key-kostl.</w:t>
+        <w:t xml:space="preserve">          RAISE EXCEPTION TYPE zcx_fi_bud_2yf MESSAGE e005(zbud_fcst) WITH is_key-kostl.</w:t>
       </w:r>
     </w:p>
     <w:p>
@@ -24948,7 +24962,7 @@
           <w:sz w:val="15"/>
           <w:szCs w:val="15"/>
         </w:rPr>
-        <w:t xml:space="preserve">            MESSAGE e006(zbud_2yf) WITH is_key-bukrs is_key-kostl lv_years lv_creator.</w:t>
+        <w:t xml:space="preserve">            MESSAGE e006(zbud_fcst) WITH is_key-bukrs is_key-kostl lv_years lv_creator.</w:t>
       </w:r>
     </w:p>
     <w:p>
@@ -25046,7 +25060,7 @@
           <w:sz w:val="15"/>
           <w:szCs w:val="15"/>
         </w:rPr>
-        <w:t xml:space="preserve">            MESSAGE e007(zbud_2yf) WITH is_key-bukrs is_key-kostl lv_years.</w:t>
+        <w:t xml:space="preserve">            MESSAGE e007(zbud_fcst) WITH is_key-bukrs is_key-kostl lv_years.</w:t>
       </w:r>
     </w:p>
     <w:p>
@@ -25116,7 +25130,7 @@
           <w:sz w:val="15"/>
           <w:szCs w:val="15"/>
         </w:rPr>
-        <w:t xml:space="preserve">          RAISE EXCEPTION TYPE zcx_fi_bud_2yf MESSAGE e008(zbud_2yf) WITH lv_creator.</w:t>
+        <w:t xml:space="preserve">          RAISE EXCEPTION TYPE zcx_fi_bud_2yf MESSAGE e008(zbud_fcst) WITH lv_creator.</w:t>
       </w:r>
     </w:p>
     <w:p>
@@ -25410,7 +25424,7 @@
           <w:sz w:val="15"/>
           <w:szCs w:val="15"/>
         </w:rPr>
-        <w:t xml:space="preserve">      RAISE EXCEPTION TYPE zcx_fi_bud_2yf MESSAGE e009(zbud_2yf).</w:t>
+        <w:t xml:space="preserve">      RAISE EXCEPTION TYPE zcx_fi_bud_2yf MESSAGE e009(zbud_fcst).</w:t>
       </w:r>
     </w:p>
     <w:p>
@@ -25522,7 +25536,7 @@
           <w:sz w:val="15"/>
           <w:szCs w:val="15"/>
         </w:rPr>
-        <w:t xml:space="preserve">          MESSAGE e025(zbud_2yf) WITH ls_item-item_no is_key-fyear_from is_key-fyear_to</w:t>
+        <w:t xml:space="preserve">          MESSAGE e025(zbud_fcst) WITH ls_item-item_no is_key-fyear_from is_key-fyear_to</w:t>
       </w:r>
     </w:p>
     <w:p>
@@ -25732,7 +25746,7 @@
           <w:sz w:val="15"/>
           <w:szCs w:val="15"/>
         </w:rPr>
-        <w:t xml:space="preserve">          MESSAGE e010(zbud_2yf) WITH ls_item-item_no lv_label</w:t>
+        <w:t xml:space="preserve">          MESSAGE e010(zbud_fcst) WITH ls_item-item_no lv_label</w:t>
       </w:r>
     </w:p>
     <w:p>
@@ -25816,7 +25830,7 @@
           <w:sz w:val="15"/>
           <w:szCs w:val="15"/>
         </w:rPr>
-        <w:t xml:space="preserve">          MESSAGE e011(zbud_2yf) WITH ls_item-item_no</w:t>
+        <w:t xml:space="preserve">          MESSAGE e011(zbud_fcst) WITH ls_item-item_no</w:t>
       </w:r>
     </w:p>
     <w:p>
@@ -26068,7 +26082,7 @@
           <w:sz w:val="15"/>
           <w:szCs w:val="15"/>
         </w:rPr>
-        <w:t xml:space="preserve">      RAISE EXCEPTION TYPE zcx_fi_bud_2yf MESSAGE e004(zbud_2yf) WITH lv_window.</w:t>
+        <w:t xml:space="preserve">      RAISE EXCEPTION TYPE zcx_fi_bud_2yf MESSAGE e004(zbud_fcst) WITH lv_window.</w:t>
       </w:r>
     </w:p>
     <w:p>
@@ -26726,7 +26740,7 @@
           <w:sz w:val="15"/>
           <w:szCs w:val="15"/>
         </w:rPr>
-        <w:t xml:space="preserve">      RAISE EXCEPTION TYPE zcx_fi_bud_2yf MESSAGE e014(zbud_2yf).</w:t>
+        <w:t xml:space="preserve">      RAISE EXCEPTION TYPE zcx_fi_bud_2yf MESSAGE e014(zbud_fcst).</w:t>
       </w:r>
     </w:p>
     <w:p>
@@ -28378,7 +28392,7 @@
           <w:sz w:val="15"/>
           <w:szCs w:val="15"/>
         </w:rPr>
-        <w:t xml:space="preserve">    rv_total = REDUCE #( INIT lv_sum TYPE z2yf_amount</w:t>
+        <w:t xml:space="preserve">    rv_total = REDUCE #( INIT lv_sum TYPE zfcst_amount</w:t>
       </w:r>
     </w:p>
     <w:p>
@@ -29945,21 +29959,21 @@
           <w:sz w:val="15"/>
           <w:szCs w:val="15"/>
         </w:rPr>
-        <w:t xml:space="preserve">      IMPORTING iv_item_no     TYPE z2yf_item_no</w:t>
-      </w:r>
-    </w:p>
-    <w:p>
-      <w:pPr>
-        <w:shd w:fill="F2F2F2" w:color="auto" w:val="clear"/>
-        <w:spacing w:after="0" w:line="228"/>
-      </w:pPr>
-      <w:r>
-        <w:rPr>
-          <w:rFonts w:ascii="Courier New" w:cs="Courier New" w:eastAsia="Courier New" w:hAnsi="Courier New"/>
-          <w:sz w:val="15"/>
-          <w:szCs w:val="15"/>
-        </w:rPr>
-        <w:t xml:space="preserve">                iv_amount      TYPE z2yf_amount</w:t>
+        <w:t xml:space="preserve">      IMPORTING iv_item_no     TYPE zfcst_item_no</w:t>
+      </w:r>
+    </w:p>
+    <w:p>
+      <w:pPr>
+        <w:shd w:fill="F2F2F2" w:color="auto" w:val="clear"/>
+        <w:spacing w:after="0" w:line="228"/>
+      </w:pPr>
+      <w:r>
+        <w:rPr>
+          <w:rFonts w:ascii="Courier New" w:cs="Courier New" w:eastAsia="Courier New" w:hAnsi="Courier New"/>
+          <w:sz w:val="15"/>
+          <w:szCs w:val="15"/>
+        </w:rPr>
+        <w:t xml:space="preserve">                iv_amount      TYPE zfcst_amount</w:t>
       </w:r>
     </w:p>
     <w:p>
@@ -30015,7 +30029,7 @@
           <w:sz w:val="15"/>
           <w:szCs w:val="15"/>
         </w:rPr>
-        <w:t xml:space="preserve">                iv_change_count  TYPE z2yf_change_cnt DEFAULT 0</w:t>
+        <w:t xml:space="preserve">                iv_change_count  TYPE zfcst_change_cnt DEFAULT 0</w:t>
       </w:r>
     </w:p>
     <w:p>
@@ -37109,7 +37123,7 @@
           <w:sz w:val="15"/>
           <w:szCs w:val="15"/>
         </w:rPr>
-        <w:t xml:space="preserve">DATA gs_head            TYPE zfi_bud_2yf_h.  "header block</w:t>
+        <w:t xml:space="preserve">DATA gs_head            TYPE zfi_bud_fcst_h.  "header block</w:t>
       </w:r>
     </w:p>
     <w:p>
@@ -37221,7 +37235,7 @@
           <w:sz w:val="15"/>
           <w:szCs w:val="15"/>
         </w:rPr>
-        <w:t xml:space="preserve">        INCLUDE STRUCTURE zfi_bud_2yf_i.</w:t>
+        <w:t xml:space="preserve">        INCLUDE STRUCTURE zfi_bud_fcst_i.</w:t>
       </w:r>
     </w:p>
     <w:p>
@@ -42722,7 +42736,7 @@
           <w:sz w:val="15"/>
           <w:szCs w:val="15"/>
         </w:rPr>
-        <w:t xml:space="preserve">      MESSAGE s019(zbud_2yf).</w:t>
+        <w:t xml:space="preserve">      MESSAGE s019(zbud_fcst).</w:t>
       </w:r>
     </w:p>
     <w:p>
@@ -42876,7 +42890,7 @@
           <w:sz w:val="15"/>
           <w:szCs w:val="15"/>
         </w:rPr>
-        <w:t xml:space="preserve">    MESSAGE i012(zbud_2yf) WITH gs_head-bukrs gs_head-kostl gv_fcst_years.</w:t>
+        <w:t xml:space="preserve">    MESSAGE i012(zbud_fcst) WITH gs_head-bukrs gs_head-kostl gv_fcst_years.</w:t>
       </w:r>
     </w:p>
     <w:p>
@@ -42904,7 +42918,7 @@
           <w:sz w:val="15"/>
           <w:szCs w:val="15"/>
         </w:rPr>
-        <w:t xml:space="preserve">      MESSAGE s018(zbud_2yf) WITH ls_result-mail_error DISPLAY LIKE 'W'.</w:t>
+        <w:t xml:space="preserve">      MESSAGE s018(zbud_fcst) WITH ls_result-mail_error DISPLAY LIKE 'W'.</w:t>
       </w:r>
     </w:p>
     <w:p>
@@ -43016,7 +43030,7 @@
           <w:sz w:val="15"/>
           <w:szCs w:val="15"/>
         </w:rPr>
-        <w:t xml:space="preserve">      MESSAGE s026(zbud_2yf) DISPLAY LIKE 'E'.</w:t>
+        <w:t xml:space="preserve">      MESSAGE s026(zbud_fcst) DISPLAY LIKE 'E'.</w:t>
       </w:r>
     </w:p>
     <w:p>
@@ -43240,7 +43254,7 @@
           <w:sz w:val="15"/>
           <w:szCs w:val="15"/>
         </w:rPr>
-        <w:t xml:space="preserve">      MESSAGE s014(zbud_2yf).</w:t>
+        <w:t xml:space="preserve">      MESSAGE s014(zbud_fcst).</w:t>
       </w:r>
     </w:p>
     <w:p>
@@ -43380,7 +43394,7 @@
           <w:sz w:val="15"/>
           <w:szCs w:val="15"/>
         </w:rPr>
-        <w:t xml:space="preserve">      MESSAGE s019(zbud_2yf).</w:t>
+        <w:t xml:space="preserve">      MESSAGE s019(zbud_fcst).</w:t>
       </w:r>
     </w:p>
     <w:p>
@@ -43562,7 +43576,7 @@
           <w:sz w:val="15"/>
           <w:szCs w:val="15"/>
         </w:rPr>
-        <w:t xml:space="preserve">    MESSAGE i013(zbud_2yf) WITH ls_result-header-change_count zif_fi_bud_2yf_types=&gt;c_max_changes.</w:t>
+        <w:t xml:space="preserve">    MESSAGE i013(zbud_fcst) WITH ls_result-header-change_count zif_fi_bud_2yf_types=&gt;c_max_changes.</w:t>
       </w:r>
     </w:p>
     <w:p>
@@ -43590,7 +43604,7 @@
           <w:sz w:val="15"/>
           <w:szCs w:val="15"/>
         </w:rPr>
-        <w:t xml:space="preserve">      MESSAGE s018(zbud_2yf) WITH ls_result-mail_error DISPLAY LIKE 'W'.</w:t>
+        <w:t xml:space="preserve">      MESSAGE s018(zbud_fcst) WITH ls_result-mail_error DISPLAY LIKE 'W'.</w:t>
       </w:r>
     </w:p>
     <w:p>
@@ -46205,7 +46219,7 @@
           <w:sz w:val="15"/>
           <w:szCs w:val="15"/>
         </w:rPr>
-        <w:t xml:space="preserve">DATA gs_selection TYPE zfi_bud_2yf_h.  "only for the SELECT-OPTIONS types</w:t>
+        <w:t xml:space="preserve">DATA gs_selection TYPE zfi_bud_fcst_h.  "only for the SELECT-OPTIONS types</w:t>
       </w:r>
     </w:p>
     <w:p>
@@ -46415,7 +46429,7 @@
           <w:sz w:val="15"/>
           <w:szCs w:val="15"/>
         </w:rPr>
-        <w:t xml:space="preserve">    MESSAGE s023(zbud_2yf) DISPLAY LIKE 'E'.</w:t>
+        <w:t xml:space="preserve">    MESSAGE s023(zbud_fcst) DISPLAY LIKE 'E'.</w:t>
       </w:r>
     </w:p>
     <w:p>
@@ -46876,7 +46890,7 @@
           <w:sz w:val="15"/>
           <w:szCs w:val="15"/>
         </w:rPr>
-        <w:t xml:space="preserve">    TYPES tt_fyear_range TYPE RANGE OF z2yf_year_from.</w:t>
+        <w:t xml:space="preserve">    TYPES tt_fyear_range TYPE RANGE OF zfcst_year_from.</w:t>
       </w:r>
     </w:p>
     <w:p>
@@ -46932,21 +46946,21 @@
           <w:sz w:val="15"/>
           <w:szCs w:val="15"/>
         </w:rPr>
-        <w:t xml:space="preserve">             bukrs        TYPE zfi_bud_2yf_h-bukrs,</w:t>
-      </w:r>
-    </w:p>
-    <w:p>
-      <w:pPr>
-        <w:shd w:fill="F2F2F2" w:color="auto" w:val="clear"/>
-        <w:spacing w:after="0" w:line="228"/>
-      </w:pPr>
-      <w:r>
-        <w:rPr>
-          <w:rFonts w:ascii="Courier New" w:cs="Courier New" w:eastAsia="Courier New" w:hAnsi="Courier New"/>
-          <w:sz w:val="15"/>
-          <w:szCs w:val="15"/>
-        </w:rPr>
-        <w:t xml:space="preserve">             kostl        TYPE zfi_bud_2yf_h-kostl,</w:t>
+        <w:t xml:space="preserve">             bukrs        TYPE zfi_bud_fcst_h-bukrs,</w:t>
+      </w:r>
+    </w:p>
+    <w:p>
+      <w:pPr>
+        <w:shd w:fill="F2F2F2" w:color="auto" w:val="clear"/>
+        <w:spacing w:after="0" w:line="228"/>
+      </w:pPr>
+      <w:r>
+        <w:rPr>
+          <w:rFonts w:ascii="Courier New" w:cs="Courier New" w:eastAsia="Courier New" w:hAnsi="Courier New"/>
+          <w:sz w:val="15"/>
+          <w:szCs w:val="15"/>
+        </w:rPr>
+        <w:t xml:space="preserve">             kostl        TYPE zfi_bud_fcst_h-kostl,</w:t>
       </w:r>
     </w:p>
     <w:p>
@@ -46988,217 +47002,217 @@
           <w:sz w:val="15"/>
           <w:szCs w:val="15"/>
         </w:rPr>
-        <w:t xml:space="preserve">             item_no      TYPE zfi_bud_2yf_i-item_no,</w:t>
-      </w:r>
-    </w:p>
-    <w:p>
-      <w:pPr>
-        <w:shd w:fill="F2F2F2" w:color="auto" w:val="clear"/>
-        <w:spacing w:after="0" w:line="228"/>
-      </w:pPr>
-      <w:r>
-        <w:rPr>
-          <w:rFonts w:ascii="Courier New" w:cs="Courier New" w:eastAsia="Courier New" w:hAnsi="Courier New"/>
-          <w:sz w:val="15"/>
-          <w:szCs w:val="15"/>
-        </w:rPr>
-        <w:t xml:space="preserve">             budget_year  TYPE zfi_bud_2yf_i-budget_year,</w:t>
-      </w:r>
-    </w:p>
-    <w:p>
-      <w:pPr>
-        <w:shd w:fill="F2F2F2" w:color="auto" w:val="clear"/>
-        <w:spacing w:after="0" w:line="228"/>
-      </w:pPr>
-      <w:r>
-        <w:rPr>
-          <w:rFonts w:ascii="Courier New" w:cs="Courier New" w:eastAsia="Courier New" w:hAnsi="Courier New"/>
-          <w:sz w:val="15"/>
-          <w:szCs w:val="15"/>
-        </w:rPr>
-        <w:t xml:space="preserve">             proj_name    TYPE zfi_bud_2yf_i-proj_name,</w:t>
-      </w:r>
-    </w:p>
-    <w:p>
-      <w:pPr>
-        <w:shd w:fill="F2F2F2" w:color="auto" w:val="clear"/>
-        <w:spacing w:after="0" w:line="228"/>
-      </w:pPr>
-      <w:r>
-        <w:rPr>
-          <w:rFonts w:ascii="Courier New" w:cs="Courier New" w:eastAsia="Courier New" w:hAnsi="Courier New"/>
-          <w:sz w:val="15"/>
-          <w:szCs w:val="15"/>
-        </w:rPr>
-        <w:t xml:space="preserve">             proj_desc    TYPE zfi_bud_2yf_i-proj_desc,</w:t>
-      </w:r>
-    </w:p>
-    <w:p>
-      <w:pPr>
-        <w:shd w:fill="F2F2F2" w:color="auto" w:val="clear"/>
-        <w:spacing w:after="0" w:line="228"/>
-      </w:pPr>
-      <w:r>
-        <w:rPr>
-          <w:rFonts w:ascii="Courier New" w:cs="Courier New" w:eastAsia="Courier New" w:hAnsi="Courier New"/>
-          <w:sz w:val="15"/>
-          <w:szCs w:val="15"/>
-        </w:rPr>
-        <w:t xml:space="preserve">             priority     TYPE zfi_bud_2yf_i-priority,</w:t>
-      </w:r>
-    </w:p>
-    <w:p>
-      <w:pPr>
-        <w:shd w:fill="F2F2F2" w:color="auto" w:val="clear"/>
-        <w:spacing w:after="0" w:line="228"/>
-      </w:pPr>
-      <w:r>
-        <w:rPr>
-          <w:rFonts w:ascii="Courier New" w:cs="Courier New" w:eastAsia="Courier New" w:hAnsi="Courier New"/>
-          <w:sz w:val="15"/>
-          <w:szCs w:val="15"/>
-        </w:rPr>
-        <w:t xml:space="preserve">             amount       TYPE zfi_bud_2yf_i-amount,</w:t>
-      </w:r>
-    </w:p>
-    <w:p>
-      <w:pPr>
-        <w:shd w:fill="F2F2F2" w:color="auto" w:val="clear"/>
-        <w:spacing w:after="0" w:line="228"/>
-      </w:pPr>
-      <w:r>
-        <w:rPr>
-          <w:rFonts w:ascii="Courier New" w:cs="Courier New" w:eastAsia="Courier New" w:hAnsi="Courier New"/>
-          <w:sz w:val="15"/>
-          <w:szCs w:val="15"/>
-        </w:rPr>
-        <w:t xml:space="preserve">             waers        TYPE zfi_bud_2yf_i-waers,</w:t>
-      </w:r>
-    </w:p>
-    <w:p>
-      <w:pPr>
-        <w:shd w:fill="F2F2F2" w:color="auto" w:val="clear"/>
-        <w:spacing w:after="0" w:line="228"/>
-      </w:pPr>
-      <w:r>
-        <w:rPr>
-          <w:rFonts w:ascii="Courier New" w:cs="Courier New" w:eastAsia="Courier New" w:hAnsi="Courier New"/>
-          <w:sz w:val="15"/>
-          <w:szCs w:val="15"/>
-        </w:rPr>
-        <w:t xml:space="preserve">             bud_type     TYPE zfi_bud_2yf_i-bud_type,</w:t>
-      </w:r>
-    </w:p>
-    <w:p>
-      <w:pPr>
-        <w:shd w:fill="F2F2F2" w:color="auto" w:val="clear"/>
-        <w:spacing w:after="0" w:line="228"/>
-      </w:pPr>
-      <w:r>
-        <w:rPr>
-          <w:rFonts w:ascii="Courier New" w:cs="Courier New" w:eastAsia="Courier New" w:hAnsi="Courier New"/>
-          <w:sz w:val="15"/>
-          <w:szCs w:val="15"/>
-        </w:rPr>
-        <w:t xml:space="preserve">             proj_type    TYPE zfi_bud_2yf_i-proj_type,</w:t>
-      </w:r>
-    </w:p>
-    <w:p>
-      <w:pPr>
-        <w:shd w:fill="F2F2F2" w:color="auto" w:val="clear"/>
-        <w:spacing w:after="0" w:line="228"/>
-      </w:pPr>
-      <w:r>
-        <w:rPr>
-          <w:rFonts w:ascii="Courier New" w:cs="Courier New" w:eastAsia="Courier New" w:hAnsi="Courier New"/>
-          <w:sz w:val="15"/>
-          <w:szCs w:val="15"/>
-        </w:rPr>
-        <w:t xml:space="preserve">             change_count TYPE zfi_bud_2yf_h-change_count,</w:t>
-      </w:r>
-    </w:p>
-    <w:p>
-      <w:pPr>
-        <w:shd w:fill="F2F2F2" w:color="auto" w:val="clear"/>
-        <w:spacing w:after="0" w:line="228"/>
-      </w:pPr>
-      <w:r>
-        <w:rPr>
-          <w:rFonts w:ascii="Courier New" w:cs="Courier New" w:eastAsia="Courier New" w:hAnsi="Courier New"/>
-          <w:sz w:val="15"/>
-          <w:szCs w:val="15"/>
-        </w:rPr>
-        <w:t xml:space="preserve">             ernam        TYPE zfi_bud_2yf_h-ernam,</w:t>
-      </w:r>
-    </w:p>
-    <w:p>
-      <w:pPr>
-        <w:shd w:fill="F2F2F2" w:color="auto" w:val="clear"/>
-        <w:spacing w:after="0" w:line="228"/>
-      </w:pPr>
-      <w:r>
-        <w:rPr>
-          <w:rFonts w:ascii="Courier New" w:cs="Courier New" w:eastAsia="Courier New" w:hAnsi="Courier New"/>
-          <w:sz w:val="15"/>
-          <w:szCs w:val="15"/>
-        </w:rPr>
-        <w:t xml:space="preserve">             erdat        TYPE zfi_bud_2yf_h-erdat,</w:t>
-      </w:r>
-    </w:p>
-    <w:p>
-      <w:pPr>
-        <w:shd w:fill="F2F2F2" w:color="auto" w:val="clear"/>
-        <w:spacing w:after="0" w:line="228"/>
-      </w:pPr>
-      <w:r>
-        <w:rPr>
-          <w:rFonts w:ascii="Courier New" w:cs="Courier New" w:eastAsia="Courier New" w:hAnsi="Courier New"/>
-          <w:sz w:val="15"/>
-          <w:szCs w:val="15"/>
-        </w:rPr>
-        <w:t xml:space="preserve">             aenam        TYPE zfi_bud_2yf_h-aenam,</w:t>
-      </w:r>
-    </w:p>
-    <w:p>
-      <w:pPr>
-        <w:shd w:fill="F2F2F2" w:color="auto" w:val="clear"/>
-        <w:spacing w:after="0" w:line="228"/>
-      </w:pPr>
-      <w:r>
-        <w:rPr>
-          <w:rFonts w:ascii="Courier New" w:cs="Courier New" w:eastAsia="Courier New" w:hAnsi="Courier New"/>
-          <w:sz w:val="15"/>
-          <w:szCs w:val="15"/>
-        </w:rPr>
-        <w:t xml:space="preserve">             aedat        TYPE zfi_bud_2yf_h-aedat,</w:t>
-      </w:r>
-    </w:p>
-    <w:p>
-      <w:pPr>
-        <w:shd w:fill="F2F2F2" w:color="auto" w:val="clear"/>
-        <w:spacing w:after="0" w:line="228"/>
-      </w:pPr>
-      <w:r>
-        <w:rPr>
-          <w:rFonts w:ascii="Courier New" w:cs="Courier New" w:eastAsia="Courier New" w:hAnsi="Courier New"/>
-          <w:sz w:val="15"/>
-          <w:szCs w:val="15"/>
-        </w:rPr>
-        <w:t xml:space="preserve">             fyear_from   TYPE zfi_bud_2yf_h-fyear_from,</w:t>
-      </w:r>
-    </w:p>
-    <w:p>
-      <w:pPr>
-        <w:shd w:fill="F2F2F2" w:color="auto" w:val="clear"/>
-        <w:spacing w:after="0" w:line="228"/>
-      </w:pPr>
-      <w:r>
-        <w:rPr>
-          <w:rFonts w:ascii="Courier New" w:cs="Courier New" w:eastAsia="Courier New" w:hAnsi="Courier New"/>
-          <w:sz w:val="15"/>
-          <w:szCs w:val="15"/>
-        </w:rPr>
-        <w:t xml:space="preserve">             fyear_to     TYPE zfi_bud_2yf_h-fyear_to,</w:t>
+        <w:t xml:space="preserve">             item_no      TYPE zfi_bud_fcst_i-item_no,</w:t>
+      </w:r>
+    </w:p>
+    <w:p>
+      <w:pPr>
+        <w:shd w:fill="F2F2F2" w:color="auto" w:val="clear"/>
+        <w:spacing w:after="0" w:line="228"/>
+      </w:pPr>
+      <w:r>
+        <w:rPr>
+          <w:rFonts w:ascii="Courier New" w:cs="Courier New" w:eastAsia="Courier New" w:hAnsi="Courier New"/>
+          <w:sz w:val="15"/>
+          <w:szCs w:val="15"/>
+        </w:rPr>
+        <w:t xml:space="preserve">             budget_year  TYPE zfi_bud_fcst_i-budget_year,</w:t>
+      </w:r>
+    </w:p>
+    <w:p>
+      <w:pPr>
+        <w:shd w:fill="F2F2F2" w:color="auto" w:val="clear"/>
+        <w:spacing w:after="0" w:line="228"/>
+      </w:pPr>
+      <w:r>
+        <w:rPr>
+          <w:rFonts w:ascii="Courier New" w:cs="Courier New" w:eastAsia="Courier New" w:hAnsi="Courier New"/>
+          <w:sz w:val="15"/>
+          <w:szCs w:val="15"/>
+        </w:rPr>
+        <w:t xml:space="preserve">             proj_name    TYPE zfi_bud_fcst_i-proj_name,</w:t>
+      </w:r>
+    </w:p>
+    <w:p>
+      <w:pPr>
+        <w:shd w:fill="F2F2F2" w:color="auto" w:val="clear"/>
+        <w:spacing w:after="0" w:line="228"/>
+      </w:pPr>
+      <w:r>
+        <w:rPr>
+          <w:rFonts w:ascii="Courier New" w:cs="Courier New" w:eastAsia="Courier New" w:hAnsi="Courier New"/>
+          <w:sz w:val="15"/>
+          <w:szCs w:val="15"/>
+        </w:rPr>
+        <w:t xml:space="preserve">             proj_desc    TYPE zfi_bud_fcst_i-proj_desc,</w:t>
+      </w:r>
+    </w:p>
+    <w:p>
+      <w:pPr>
+        <w:shd w:fill="F2F2F2" w:color="auto" w:val="clear"/>
+        <w:spacing w:after="0" w:line="228"/>
+      </w:pPr>
+      <w:r>
+        <w:rPr>
+          <w:rFonts w:ascii="Courier New" w:cs="Courier New" w:eastAsia="Courier New" w:hAnsi="Courier New"/>
+          <w:sz w:val="15"/>
+          <w:szCs w:val="15"/>
+        </w:rPr>
+        <w:t xml:space="preserve">             priority     TYPE zfi_bud_fcst_i-priority,</w:t>
+      </w:r>
+    </w:p>
+    <w:p>
+      <w:pPr>
+        <w:shd w:fill="F2F2F2" w:color="auto" w:val="clear"/>
+        <w:spacing w:after="0" w:line="228"/>
+      </w:pPr>
+      <w:r>
+        <w:rPr>
+          <w:rFonts w:ascii="Courier New" w:cs="Courier New" w:eastAsia="Courier New" w:hAnsi="Courier New"/>
+          <w:sz w:val="15"/>
+          <w:szCs w:val="15"/>
+        </w:rPr>
+        <w:t xml:space="preserve">             amount       TYPE zfi_bud_fcst_i-amount,</w:t>
+      </w:r>
+    </w:p>
+    <w:p>
+      <w:pPr>
+        <w:shd w:fill="F2F2F2" w:color="auto" w:val="clear"/>
+        <w:spacing w:after="0" w:line="228"/>
+      </w:pPr>
+      <w:r>
+        <w:rPr>
+          <w:rFonts w:ascii="Courier New" w:cs="Courier New" w:eastAsia="Courier New" w:hAnsi="Courier New"/>
+          <w:sz w:val="15"/>
+          <w:szCs w:val="15"/>
+        </w:rPr>
+        <w:t xml:space="preserve">             waers        TYPE zfi_bud_fcst_i-waers,</w:t>
+      </w:r>
+    </w:p>
+    <w:p>
+      <w:pPr>
+        <w:shd w:fill="F2F2F2" w:color="auto" w:val="clear"/>
+        <w:spacing w:after="0" w:line="228"/>
+      </w:pPr>
+      <w:r>
+        <w:rPr>
+          <w:rFonts w:ascii="Courier New" w:cs="Courier New" w:eastAsia="Courier New" w:hAnsi="Courier New"/>
+          <w:sz w:val="15"/>
+          <w:szCs w:val="15"/>
+        </w:rPr>
+        <w:t xml:space="preserve">             bud_type     TYPE zfi_bud_fcst_i-bud_type,</w:t>
+      </w:r>
+    </w:p>
+    <w:p>
+      <w:pPr>
+        <w:shd w:fill="F2F2F2" w:color="auto" w:val="clear"/>
+        <w:spacing w:after="0" w:line="228"/>
+      </w:pPr>
+      <w:r>
+        <w:rPr>
+          <w:rFonts w:ascii="Courier New" w:cs="Courier New" w:eastAsia="Courier New" w:hAnsi="Courier New"/>
+          <w:sz w:val="15"/>
+          <w:szCs w:val="15"/>
+        </w:rPr>
+        <w:t xml:space="preserve">             proj_type    TYPE zfi_bud_fcst_i-proj_type,</w:t>
+      </w:r>
+    </w:p>
+    <w:p>
+      <w:pPr>
+        <w:shd w:fill="F2F2F2" w:color="auto" w:val="clear"/>
+        <w:spacing w:after="0" w:line="228"/>
+      </w:pPr>
+      <w:r>
+        <w:rPr>
+          <w:rFonts w:ascii="Courier New" w:cs="Courier New" w:eastAsia="Courier New" w:hAnsi="Courier New"/>
+          <w:sz w:val="15"/>
+          <w:szCs w:val="15"/>
+        </w:rPr>
+        <w:t xml:space="preserve">             change_count TYPE zfi_bud_fcst_h-change_count,</w:t>
+      </w:r>
+    </w:p>
+    <w:p>
+      <w:pPr>
+        <w:shd w:fill="F2F2F2" w:color="auto" w:val="clear"/>
+        <w:spacing w:after="0" w:line="228"/>
+      </w:pPr>
+      <w:r>
+        <w:rPr>
+          <w:rFonts w:ascii="Courier New" w:cs="Courier New" w:eastAsia="Courier New" w:hAnsi="Courier New"/>
+          <w:sz w:val="15"/>
+          <w:szCs w:val="15"/>
+        </w:rPr>
+        <w:t xml:space="preserve">             ernam        TYPE zfi_bud_fcst_h-ernam,</w:t>
+      </w:r>
+    </w:p>
+    <w:p>
+      <w:pPr>
+        <w:shd w:fill="F2F2F2" w:color="auto" w:val="clear"/>
+        <w:spacing w:after="0" w:line="228"/>
+      </w:pPr>
+      <w:r>
+        <w:rPr>
+          <w:rFonts w:ascii="Courier New" w:cs="Courier New" w:eastAsia="Courier New" w:hAnsi="Courier New"/>
+          <w:sz w:val="15"/>
+          <w:szCs w:val="15"/>
+        </w:rPr>
+        <w:t xml:space="preserve">             erdat        TYPE zfi_bud_fcst_h-erdat,</w:t>
+      </w:r>
+    </w:p>
+    <w:p>
+      <w:pPr>
+        <w:shd w:fill="F2F2F2" w:color="auto" w:val="clear"/>
+        <w:spacing w:after="0" w:line="228"/>
+      </w:pPr>
+      <w:r>
+        <w:rPr>
+          <w:rFonts w:ascii="Courier New" w:cs="Courier New" w:eastAsia="Courier New" w:hAnsi="Courier New"/>
+          <w:sz w:val="15"/>
+          <w:szCs w:val="15"/>
+        </w:rPr>
+        <w:t xml:space="preserve">             aenam        TYPE zfi_bud_fcst_h-aenam,</w:t>
+      </w:r>
+    </w:p>
+    <w:p>
+      <w:pPr>
+        <w:shd w:fill="F2F2F2" w:color="auto" w:val="clear"/>
+        <w:spacing w:after="0" w:line="228"/>
+      </w:pPr>
+      <w:r>
+        <w:rPr>
+          <w:rFonts w:ascii="Courier New" w:cs="Courier New" w:eastAsia="Courier New" w:hAnsi="Courier New"/>
+          <w:sz w:val="15"/>
+          <w:szCs w:val="15"/>
+        </w:rPr>
+        <w:t xml:space="preserve">             aedat        TYPE zfi_bud_fcst_h-aedat,</w:t>
+      </w:r>
+    </w:p>
+    <w:p>
+      <w:pPr>
+        <w:shd w:fill="F2F2F2" w:color="auto" w:val="clear"/>
+        <w:spacing w:after="0" w:line="228"/>
+      </w:pPr>
+      <w:r>
+        <w:rPr>
+          <w:rFonts w:ascii="Courier New" w:cs="Courier New" w:eastAsia="Courier New" w:hAnsi="Courier New"/>
+          <w:sz w:val="15"/>
+          <w:szCs w:val="15"/>
+        </w:rPr>
+        <w:t xml:space="preserve">             fyear_from   TYPE zfi_bud_fcst_h-fyear_from,</w:t>
+      </w:r>
+    </w:p>
+    <w:p>
+      <w:pPr>
+        <w:shd w:fill="F2F2F2" w:color="auto" w:val="clear"/>
+        <w:spacing w:after="0" w:line="228"/>
+      </w:pPr>
+      <w:r>
+        <w:rPr>
+          <w:rFonts w:ascii="Courier New" w:cs="Courier New" w:eastAsia="Courier New" w:hAnsi="Courier New"/>
+          <w:sz w:val="15"/>
+          <w:szCs w:val="15"/>
+        </w:rPr>
+        <w:t xml:space="preserve">             fyear_to     TYPE zfi_bud_fcst_h-fyear_to,</w:t>
       </w:r>
     </w:p>
     <w:p>
@@ -47268,21 +47282,21 @@
           <w:sz w:val="15"/>
           <w:szCs w:val="15"/>
         </w:rPr>
-        <w:t xml:space="preserve">             change_no  TYPE zfi_bud_2yf_log-change_no,</w:t>
-      </w:r>
-    </w:p>
-    <w:p>
-      <w:pPr>
-        <w:shd w:fill="F2F2F2" w:color="auto" w:val="clear"/>
-        <w:spacing w:after="0" w:line="228"/>
-      </w:pPr>
-      <w:r>
-        <w:rPr>
-          <w:rFonts w:ascii="Courier New" w:cs="Courier New" w:eastAsia="Courier New" w:hAnsi="Courier New"/>
-          <w:sz w:val="15"/>
-          <w:szCs w:val="15"/>
-        </w:rPr>
-        <w:t xml:space="preserve">             changed_by TYPE zfi_bud_2yf_log-changed_by,</w:t>
+        <w:t xml:space="preserve">             change_no  TYPE zfi_bud_fcst_log-change_no,</w:t>
+      </w:r>
+    </w:p>
+    <w:p>
+      <w:pPr>
+        <w:shd w:fill="F2F2F2" w:color="auto" w:val="clear"/>
+        <w:spacing w:after="0" w:line="228"/>
+      </w:pPr>
+      <w:r>
+        <w:rPr>
+          <w:rFonts w:ascii="Courier New" w:cs="Courier New" w:eastAsia="Courier New" w:hAnsi="Courier New"/>
+          <w:sz w:val="15"/>
+          <w:szCs w:val="15"/>
+        </w:rPr>
+        <w:t xml:space="preserve">             changed_by TYPE zfi_bud_fcst_log-changed_by,</w:t>
       </w:r>
     </w:p>
     <w:p>
@@ -47310,35 +47324,35 @@
           <w:sz w:val="15"/>
           <w:szCs w:val="15"/>
         </w:rPr>
-        <w:t xml:space="preserve">             changed_on TYPE zfi_bud_2yf_log-changed_on,</w:t>
-      </w:r>
-    </w:p>
-    <w:p>
-      <w:pPr>
-        <w:shd w:fill="F2F2F2" w:color="auto" w:val="clear"/>
-        <w:spacing w:after="0" w:line="228"/>
-      </w:pPr>
-      <w:r>
-        <w:rPr>
-          <w:rFonts w:ascii="Courier New" w:cs="Courier New" w:eastAsia="Courier New" w:hAnsi="Courier New"/>
-          <w:sz w:val="15"/>
-          <w:szCs w:val="15"/>
-        </w:rPr>
-        <w:t xml:space="preserve">             changed_at TYPE zfi_bud_2yf_log-changed_at,</w:t>
-      </w:r>
-    </w:p>
-    <w:p>
-      <w:pPr>
-        <w:shd w:fill="F2F2F2" w:color="auto" w:val="clear"/>
-        <w:spacing w:after="0" w:line="228"/>
-      </w:pPr>
-      <w:r>
-        <w:rPr>
-          <w:rFonts w:ascii="Courier New" w:cs="Courier New" w:eastAsia="Courier New" w:hAnsi="Courier New"/>
-          <w:sz w:val="15"/>
-          <w:szCs w:val="15"/>
-        </w:rPr>
-        <w:t xml:space="preserve">             item_no    TYPE zfi_bud_2yf_log-item_no,</w:t>
+        <w:t xml:space="preserve">             changed_on TYPE zfi_bud_fcst_log-changed_on,</w:t>
+      </w:r>
+    </w:p>
+    <w:p>
+      <w:pPr>
+        <w:shd w:fill="F2F2F2" w:color="auto" w:val="clear"/>
+        <w:spacing w:after="0" w:line="228"/>
+      </w:pPr>
+      <w:r>
+        <w:rPr>
+          <w:rFonts w:ascii="Courier New" w:cs="Courier New" w:eastAsia="Courier New" w:hAnsi="Courier New"/>
+          <w:sz w:val="15"/>
+          <w:szCs w:val="15"/>
+        </w:rPr>
+        <w:t xml:space="preserve">             changed_at TYPE zfi_bud_fcst_log-changed_at,</w:t>
+      </w:r>
+    </w:p>
+    <w:p>
+      <w:pPr>
+        <w:shd w:fill="F2F2F2" w:color="auto" w:val="clear"/>
+        <w:spacing w:after="0" w:line="228"/>
+      </w:pPr>
+      <w:r>
+        <w:rPr>
+          <w:rFonts w:ascii="Courier New" w:cs="Courier New" w:eastAsia="Courier New" w:hAnsi="Courier New"/>
+          <w:sz w:val="15"/>
+          <w:szCs w:val="15"/>
+        </w:rPr>
+        <w:t xml:space="preserve">             item_no    TYPE zfi_bud_fcst_log-item_no,</w:t>
       </w:r>
     </w:p>
     <w:p>
@@ -47366,35 +47380,35 @@
           <w:sz w:val="15"/>
           <w:szCs w:val="15"/>
         </w:rPr>
-        <w:t xml:space="preserve">             field_text TYPE zfi_bud_2yf_log-field_text,</w:t>
-      </w:r>
-    </w:p>
-    <w:p>
-      <w:pPr>
-        <w:shd w:fill="F2F2F2" w:color="auto" w:val="clear"/>
-        <w:spacing w:after="0" w:line="228"/>
-      </w:pPr>
-      <w:r>
-        <w:rPr>
-          <w:rFonts w:ascii="Courier New" w:cs="Courier New" w:eastAsia="Courier New" w:hAnsi="Courier New"/>
-          <w:sz w:val="15"/>
-          <w:szCs w:val="15"/>
-        </w:rPr>
-        <w:t xml:space="preserve">             value_old  TYPE zfi_bud_2yf_log-value_old,</w:t>
-      </w:r>
-    </w:p>
-    <w:p>
-      <w:pPr>
-        <w:shd w:fill="F2F2F2" w:color="auto" w:val="clear"/>
-        <w:spacing w:after="0" w:line="228"/>
-      </w:pPr>
-      <w:r>
-        <w:rPr>
-          <w:rFonts w:ascii="Courier New" w:cs="Courier New" w:eastAsia="Courier New" w:hAnsi="Courier New"/>
-          <w:sz w:val="15"/>
-          <w:szCs w:val="15"/>
-        </w:rPr>
-        <w:t xml:space="preserve">             value_new  TYPE zfi_bud_2yf_log-value_new,</w:t>
+        <w:t xml:space="preserve">             field_text TYPE zfi_bud_fcst_log-field_text,</w:t>
+      </w:r>
+    </w:p>
+    <w:p>
+      <w:pPr>
+        <w:shd w:fill="F2F2F2" w:color="auto" w:val="clear"/>
+        <w:spacing w:after="0" w:line="228"/>
+      </w:pPr>
+      <w:r>
+        <w:rPr>
+          <w:rFonts w:ascii="Courier New" w:cs="Courier New" w:eastAsia="Courier New" w:hAnsi="Courier New"/>
+          <w:sz w:val="15"/>
+          <w:szCs w:val="15"/>
+        </w:rPr>
+        <w:t xml:space="preserve">             value_old  TYPE zfi_bud_fcst_log-value_old,</w:t>
+      </w:r>
+    </w:p>
+    <w:p>
+      <w:pPr>
+        <w:shd w:fill="F2F2F2" w:color="auto" w:val="clear"/>
+        <w:spacing w:after="0" w:line="228"/>
+      </w:pPr>
+      <w:r>
+        <w:rPr>
+          <w:rFonts w:ascii="Courier New" w:cs="Courier New" w:eastAsia="Courier New" w:hAnsi="Courier New"/>
+          <w:sz w:val="15"/>
+          <w:szCs w:val="15"/>
+        </w:rPr>
+        <w:t xml:space="preserve">             value_new  TYPE zfi_bud_fcst_log-value_new,</w:t>
       </w:r>
     </w:p>
     <w:p>
@@ -48388,7 +48402,7 @@
           <w:sz w:val="15"/>
           <w:szCs w:val="15"/>
         </w:rPr>
-        <w:t xml:space="preserve">      RAISE EXCEPTION TYPE zcx_fi_bud_2yf MESSAGE e023(zbud_2yf).</w:t>
+        <w:t xml:space="preserve">      RAISE EXCEPTION TYPE zcx_fi_bud_2yf MESSAGE e023(zbud_fcst).</w:t>
       </w:r>
     </w:p>
     <w:p>
@@ -48458,7 +48472,7 @@
           <w:sz w:val="15"/>
           <w:szCs w:val="15"/>
         </w:rPr>
-        <w:t xml:space="preserve">      RAISE EXCEPTION TYPE zcx_fi_bud_2yf MESSAGE e024(zbud_2yf).</w:t>
+        <w:t xml:space="preserve">      RAISE EXCEPTION TYPE zcx_fi_bud_2yf MESSAGE e024(zbud_fcst).</w:t>
       </w:r>
     </w:p>
     <w:p>
@@ -48892,21 +48906,21 @@
           <w:sz w:val="15"/>
           <w:szCs w:val="15"/>
         </w:rPr>
-        <w:t xml:space="preserve">      FROM zfi_bud_2yf_h AS h</w:t>
-      </w:r>
-    </w:p>
-    <w:p>
-      <w:pPr>
-        <w:shd w:fill="F2F2F2" w:color="auto" w:val="clear"/>
-        <w:spacing w:after="0" w:line="228"/>
-      </w:pPr>
-      <w:r>
-        <w:rPr>
-          <w:rFonts w:ascii="Courier New" w:cs="Courier New" w:eastAsia="Courier New" w:hAnsi="Courier New"/>
-          <w:sz w:val="15"/>
-          <w:szCs w:val="15"/>
-        </w:rPr>
-        <w:t xml:space="preserve">      INNER JOIN zfi_bud_2yf_i AS i</w:t>
+        <w:t xml:space="preserve">      FROM zfi_bud_fcst_h AS h</w:t>
+      </w:r>
+    </w:p>
+    <w:p>
+      <w:pPr>
+        <w:shd w:fill="F2F2F2" w:color="auto" w:val="clear"/>
+        <w:spacing w:after="0" w:line="228"/>
+      </w:pPr>
+      <w:r>
+        <w:rPr>
+          <w:rFonts w:ascii="Courier New" w:cs="Courier New" w:eastAsia="Courier New" w:hAnsi="Courier New"/>
+          <w:sz w:val="15"/>
+          <w:szCs w:val="15"/>
+        </w:rPr>
+        <w:t xml:space="preserve">      INNER JOIN zfi_bud_fcst_i AS i</w:t>
       </w:r>
     </w:p>
     <w:p>
@@ -50250,7 +50264,7 @@
           <w:sz w:val="15"/>
           <w:szCs w:val="15"/>
         </w:rPr>
-        <w:t xml:space="preserve">      MESSAGE s027(zbud_2yf) WITH ls_out-bukrs ls_out-kostl ls_out-fcst_years.</w:t>
+        <w:t xml:space="preserve">      MESSAGE s027(zbud_fcst) WITH ls_out-bukrs ls_out-kostl ls_out-fcst_years.</w:t>
       </w:r>
     </w:p>
     <w:p>
@@ -50446,7 +50460,7 @@
           <w:sz w:val="15"/>
           <w:szCs w:val="15"/>
         </w:rPr>
-        <w:t xml:space="preserve">      MESSAGE s027(zbud_2yf) WITH is_out-bukrs is_out-kostl is_out-fcst_years.</w:t>
+        <w:t xml:space="preserve">      MESSAGE s027(zbud_fcst) WITH is_out-bukrs is_out-kostl is_out-fcst_years.</w:t>
       </w:r>
     </w:p>
     <w:p>
@@ -52608,18 +52622,6 @@
     </w:lvl>
   </w:abstractNum>
   <w:abstractNum w:abstractNumId="15" w15:restartNumberingAfterBreak="0">
-    <w:multiLevelType w:val="hybridMultilevel"/>
-    <w:lvl w:ilvl="0" w15:tentative="1">
-      <w:start w:val="1"/>
-      <w:numFmt w:val="decimal"/>
-      <w:lvlText w:val="%1."/>
-      <w:lvlJc w:val="left"/>
-      <w:pPr>
-        <w:ind w:left="540" w:hanging="360"/>
-      </w:pPr>
-    </w:lvl>
-  </w:abstractNum>
-  <w:abstractNum w:abstractNumId="16" w15:restartNumberingAfterBreak="0">
     <w:multiLevelType w:val="hybridMultilevel"/>
     <w:lvl w:ilvl="0" w15:tentative="1">
       <w:start w:val="1"/>
@@ -52717,12 +52719,6 @@
   </w:num>
   <w:num w:numId="15">
     <w:abstractNumId w:val="15"/>
-    <w:lvlOverride w:ilvl="0">
-      <w:startOverride w:val="1"/>
-    </w:lvlOverride>
-  </w:num>
-  <w:num w:numId="16">
-    <w:abstractNumId w:val="16"/>
     <w:lvlOverride w:ilvl="0">
       <w:startOverride w:val="1"/>
     </w:lvlOverride>

</xml_diff>

<commit_message>
Fix syntax error in BUILD_CHANGE_LOG (VALUE with only BASE)
VALUE ty_log( BASE CORRESPONDING #( ... ) ) with no further components
is rejected by the compiler. The log key fields are now assigned
explicitly. The other BASE CORRESPONDING #( ) uses get an explicit
target type so the type does not have to be inferred.

Co-Authored-By: Claude Opus 5.5 <noreply@anthropic.com>
Claude-Session: https://claude.ai/code/session_018v514gXErg4EbBGrdeHBh4
</commit_message>
<xml_diff>
--- a/budget_forecast/TSD - Budget Forecast 2YF (ZFI_BUD_2YF).docx
+++ b/budget_forecast/TSD - Budget Forecast 2YF (ZFI_BUD_2YF).docx
@@ -26180,7 +26180,7 @@
           <w:sz w:val="15"/>
           <w:szCs w:val="15"/>
         </w:rPr>
-        <w:t xml:space="preserve">    rs_result-header = VALUE #( BASE CORRESPONDING #( is_key )</w:t>
+        <w:t xml:space="preserve">    rs_result-header = VALUE #( BASE CORRESPONDING ty_header( is_key )</w:t>
       </w:r>
     </w:p>
     <w:p>
@@ -27300,63 +27300,105 @@
           <w:sz w:val="15"/>
           <w:szCs w:val="15"/>
         </w:rPr>
-        <w:t xml:space="preserve">                      BASE CORRESPONDING #( is_header_new MAPPING change_no = change_count</w:t>
-      </w:r>
-    </w:p>
-    <w:p>
-      <w:pPr>
-        <w:shd w:fill="F2F2F2" w:color="auto" w:val="clear"/>
-        <w:spacing w:after="0" w:line="228"/>
-      </w:pPr>
-      <w:r>
-        <w:rPr>
-          <w:rFonts w:ascii="Courier New" w:cs="Courier New" w:eastAsia="Courier New" w:hAnsi="Courier New"/>
-          <w:sz w:val="15"/>
-          <w:szCs w:val="15"/>
-        </w:rPr>
-        <w:t xml:space="preserve">                                                                  changed_by = aenam</w:t>
-      </w:r>
-    </w:p>
-    <w:p>
-      <w:pPr>
-        <w:shd w:fill="F2F2F2" w:color="auto" w:val="clear"/>
-        <w:spacing w:after="0" w:line="228"/>
-      </w:pPr>
-      <w:r>
-        <w:rPr>
-          <w:rFonts w:ascii="Courier New" w:cs="Courier New" w:eastAsia="Courier New" w:hAnsi="Courier New"/>
-          <w:sz w:val="15"/>
-          <w:szCs w:val="15"/>
-        </w:rPr>
-        <w:t xml:space="preserve">                                                                  changed_on = aedat</w:t>
-      </w:r>
-    </w:p>
-    <w:p>
-      <w:pPr>
-        <w:shd w:fill="F2F2F2" w:color="auto" w:val="clear"/>
-        <w:spacing w:after="0" w:line="228"/>
-      </w:pPr>
-      <w:r>
-        <w:rPr>
-          <w:rFonts w:ascii="Courier New" w:cs="Courier New" w:eastAsia="Courier New" w:hAnsi="Courier New"/>
-          <w:sz w:val="15"/>
-          <w:szCs w:val="15"/>
-        </w:rPr>
-        <w:t xml:space="preserve">                                                                  changed_at = aezet</w:t>
-      </w:r>
-    </w:p>
-    <w:p>
-      <w:pPr>
-        <w:shd w:fill="F2F2F2" w:color="auto" w:val="clear"/>
-        <w:spacing w:after="0" w:line="228"/>
-      </w:pPr>
-      <w:r>
-        <w:rPr>
-          <w:rFonts w:ascii="Courier New" w:cs="Courier New" w:eastAsia="Courier New" w:hAnsi="Courier New"/>
-          <w:sz w:val="15"/>
-          <w:szCs w:val="15"/>
-        </w:rPr>
-        <w:t xml:space="preserve">                                                          EXCEPT mandt ) ).</w:t>
+        <w:t xml:space="preserve">                      bukrs      = is_header_new-bukrs</w:t>
+      </w:r>
+    </w:p>
+    <w:p>
+      <w:pPr>
+        <w:shd w:fill="F2F2F2" w:color="auto" w:val="clear"/>
+        <w:spacing w:after="0" w:line="228"/>
+      </w:pPr>
+      <w:r>
+        <w:rPr>
+          <w:rFonts w:ascii="Courier New" w:cs="Courier New" w:eastAsia="Courier New" w:hAnsi="Courier New"/>
+          <w:sz w:val="15"/>
+          <w:szCs w:val="15"/>
+        </w:rPr>
+        <w:t xml:space="preserve">                      kostl      = is_header_new-kostl</w:t>
+      </w:r>
+    </w:p>
+    <w:p>
+      <w:pPr>
+        <w:shd w:fill="F2F2F2" w:color="auto" w:val="clear"/>
+        <w:spacing w:after="0" w:line="228"/>
+      </w:pPr>
+      <w:r>
+        <w:rPr>
+          <w:rFonts w:ascii="Courier New" w:cs="Courier New" w:eastAsia="Courier New" w:hAnsi="Courier New"/>
+          <w:sz w:val="15"/>
+          <w:szCs w:val="15"/>
+        </w:rPr>
+        <w:t xml:space="preserve">                      fyear_from = is_header_new-fyear_from</w:t>
+      </w:r>
+    </w:p>
+    <w:p>
+      <w:pPr>
+        <w:shd w:fill="F2F2F2" w:color="auto" w:val="clear"/>
+        <w:spacing w:after="0" w:line="228"/>
+      </w:pPr>
+      <w:r>
+        <w:rPr>
+          <w:rFonts w:ascii="Courier New" w:cs="Courier New" w:eastAsia="Courier New" w:hAnsi="Courier New"/>
+          <w:sz w:val="15"/>
+          <w:szCs w:val="15"/>
+        </w:rPr>
+        <w:t xml:space="preserve">                      fyear_to   = is_header_new-fyear_to</w:t>
+      </w:r>
+    </w:p>
+    <w:p>
+      <w:pPr>
+        <w:shd w:fill="F2F2F2" w:color="auto" w:val="clear"/>
+        <w:spacing w:after="0" w:line="228"/>
+      </w:pPr>
+      <w:r>
+        <w:rPr>
+          <w:rFonts w:ascii="Courier New" w:cs="Courier New" w:eastAsia="Courier New" w:hAnsi="Courier New"/>
+          <w:sz w:val="15"/>
+          <w:szCs w:val="15"/>
+        </w:rPr>
+        <w:t xml:space="preserve">                      change_no  = is_header_new-change_count</w:t>
+      </w:r>
+    </w:p>
+    <w:p>
+      <w:pPr>
+        <w:shd w:fill="F2F2F2" w:color="auto" w:val="clear"/>
+        <w:spacing w:after="0" w:line="228"/>
+      </w:pPr>
+      <w:r>
+        <w:rPr>
+          <w:rFonts w:ascii="Courier New" w:cs="Courier New" w:eastAsia="Courier New" w:hAnsi="Courier New"/>
+          <w:sz w:val="15"/>
+          <w:szCs w:val="15"/>
+        </w:rPr>
+        <w:t xml:space="preserve">                      changed_by = is_header_new-aenam</w:t>
+      </w:r>
+    </w:p>
+    <w:p>
+      <w:pPr>
+        <w:shd w:fill="F2F2F2" w:color="auto" w:val="clear"/>
+        <w:spacing w:after="0" w:line="228"/>
+      </w:pPr>
+      <w:r>
+        <w:rPr>
+          <w:rFonts w:ascii="Courier New" w:cs="Courier New" w:eastAsia="Courier New" w:hAnsi="Courier New"/>
+          <w:sz w:val="15"/>
+          <w:szCs w:val="15"/>
+        </w:rPr>
+        <w:t xml:space="preserve">                      changed_on = is_header_new-aedat</w:t>
+      </w:r>
+    </w:p>
+    <w:p>
+      <w:pPr>
+        <w:shd w:fill="F2F2F2" w:color="auto" w:val="clear"/>
+        <w:spacing w:after="0" w:line="228"/>
+      </w:pPr>
+      <w:r>
+        <w:rPr>
+          <w:rFonts w:ascii="Courier New" w:cs="Courier New" w:eastAsia="Courier New" w:hAnsi="Courier New"/>
+          <w:sz w:val="15"/>
+          <w:szCs w:val="15"/>
+        </w:rPr>
+        <w:t xml:space="preserve">                      changed_at = is_header_new-aezet ).</w:t>
       </w:r>
     </w:p>
     <w:p>
@@ -30519,7 +30561,7 @@
           <w:sz w:val="15"/>
           <w:szCs w:val="15"/>
         </w:rPr>
-        <w:t xml:space="preserve">    rs_header = VALUE #( BASE CORRESPONDING #( key( ) )</w:t>
+        <w:t xml:space="preserve">    rs_header = VALUE #( BASE CORRESPONDING zcl_fi_bud_2yf=&gt;ty_header( key( ) )</w:t>
       </w:r>
     </w:p>
     <w:p>
@@ -50544,7 +50586,7 @@
           <w:sz w:val="15"/>
           <w:szCs w:val="15"/>
         </w:rPr>
-        <w:t xml:space="preserve">      ( VALUE #( BASE CORRESPONDING #( ls_log )</w:t>
+        <w:t xml:space="preserve">      ( VALUE #( BASE CORRESPONDING ty_log_out( ls_log )</w:t>
       </w:r>
     </w:p>
     <w:p>

</xml_diff>

<commit_message>
Fix SPLIT_YEARS: compare years numerically
Co-Authored-By: Claude Opus 5.5 <noreply@anthropic.com>
Claude-Session: https://claude.ai/code/session_018v514gXErg4EbBGrdeHBh4
</commit_message>
<xml_diff>
--- a/budget_forecast/TSD - Budget Forecast 2YF (ZFI_BUD_2YF).docx
+++ b/budget_forecast/TSD - Budget Forecast 2YF (ZFI_BUD_2YF).docx
@@ -24024,6 +24024,20 @@
           <w:sz w:val="15"/>
           <w:szCs w:val="15"/>
         </w:rPr>
+        <w:t xml:space="preserve">    " format check first: two 4-digit years</w:t>
+      </w:r>
+    </w:p>
+    <w:p>
+      <w:pPr>
+        <w:shd w:fill="F2F2F2" w:color="auto" w:val="clear"/>
+        <w:spacing w:after="0" w:line="228"/>
+      </w:pPr>
+      <w:r>
+        <w:rPr>
+          <w:rFonts w:ascii="Courier New" w:cs="Courier New" w:eastAsia="Courier New" w:hAnsi="Courier New"/>
+          <w:sz w:val="15"/>
+          <w:szCs w:val="15"/>
+        </w:rPr>
         <w:t xml:space="preserve">    IF strlen( lv_from ) &lt;&gt; 4 OR lv_from CN '0123456789' OR</w:t>
       </w:r>
     </w:p>
@@ -24038,21 +24052,7 @@
           <w:sz w:val="15"/>
           <w:szCs w:val="15"/>
         </w:rPr>
-        <w:t xml:space="preserve">       strlen( lv_to )   &lt;&gt; 4 OR lv_to   CN '0123456789' OR</w:t>
-      </w:r>
-    </w:p>
-    <w:p>
-      <w:pPr>
-        <w:shd w:fill="F2F2F2" w:color="auto" w:val="clear"/>
-        <w:spacing w:after="0" w:line="228"/>
-      </w:pPr>
-      <w:r>
-        <w:rPr>
-          <w:rFonts w:ascii="Courier New" w:cs="Courier New" w:eastAsia="Courier New" w:hAnsi="Courier New"/>
-          <w:sz w:val="15"/>
-          <w:szCs w:val="15"/>
-        </w:rPr>
-        <w:t xml:space="preserve">       lv_to &lt;&gt; lv_from + 1.</w:t>
+        <w:t xml:space="preserve">       strlen( lv_to )   &lt;&gt; 4 OR lv_to   CN '0123456789'.</w:t>
       </w:r>
     </w:p>
     <w:p>
@@ -24108,7 +24108,63 @@
           <w:sz w:val="15"/>
           <w:szCs w:val="15"/>
         </w:rPr>
+        <w:t xml:space="preserve">    " numeric compare: the second year must follow the first</w:t>
+      </w:r>
+    </w:p>
+    <w:p>
+      <w:pPr>
+        <w:shd w:fill="F2F2F2" w:color="auto" w:val="clear"/>
+        <w:spacing w:after="0" w:line="228"/>
+      </w:pPr>
+      <w:r>
+        <w:rPr>
+          <w:rFonts w:ascii="Courier New" w:cs="Courier New" w:eastAsia="Courier New" w:hAnsi="Courier New"/>
+          <w:sz w:val="15"/>
+          <w:szCs w:val="15"/>
+        </w:rPr>
         <w:t xml:space="preserve">    rs_years = VALUE #( fyear_from = lv_from fyear_to = lv_to ).</w:t>
+      </w:r>
+    </w:p>
+    <w:p>
+      <w:pPr>
+        <w:shd w:fill="F2F2F2" w:color="auto" w:val="clear"/>
+        <w:spacing w:after="0" w:line="228"/>
+      </w:pPr>
+      <w:r>
+        <w:rPr>
+          <w:rFonts w:ascii="Courier New" w:cs="Courier New" w:eastAsia="Courier New" w:hAnsi="Courier New"/>
+          <w:sz w:val="15"/>
+          <w:szCs w:val="15"/>
+        </w:rPr>
+        <w:t xml:space="preserve">    IF CONV i( rs_years-fyear_to ) &lt;&gt; CONV i( rs_years-fyear_from ) + 1.</w:t>
+      </w:r>
+    </w:p>
+    <w:p>
+      <w:pPr>
+        <w:shd w:fill="F2F2F2" w:color="auto" w:val="clear"/>
+        <w:spacing w:after="0" w:line="228"/>
+      </w:pPr>
+      <w:r>
+        <w:rPr>
+          <w:rFonts w:ascii="Courier New" w:cs="Courier New" w:eastAsia="Courier New" w:hAnsi="Courier New"/>
+          <w:sz w:val="15"/>
+          <w:szCs w:val="15"/>
+        </w:rPr>
+        <w:t xml:space="preserve">      RAISE EXCEPTION TYPE zcx_fi_bud_2yf MESSAGE e003(zbud_fcst).</w:t>
+      </w:r>
+    </w:p>
+    <w:p>
+      <w:pPr>
+        <w:shd w:fill="F2F2F2" w:color="auto" w:val="clear"/>
+        <w:spacing w:after="0" w:line="228"/>
+      </w:pPr>
+      <w:r>
+        <w:rPr>
+          <w:rFonts w:ascii="Courier New" w:cs="Courier New" w:eastAsia="Courier New" w:hAnsi="Courier New"/>
+          <w:sz w:val="15"/>
+          <w:szCs w:val="15"/>
+        </w:rPr>
+        <w:t xml:space="preserve">    ENDIF.</w:t>
       </w:r>
     </w:p>
     <w:p>

</xml_diff>

<commit_message>
Fix SET CURSOR FIELD in SHOW_ERROR: use a char field, not a string
Co-Authored-By: Claude Opus 5.5 <noreply@anthropic.com>
Claude-Session: https://claude.ai/code/session_018v514gXErg4EbBGrdeHBh4
</commit_message>
<xml_diff>
--- a/budget_forecast/TSD - Budget Forecast 2YF (ZFI_BUD_2YF).docx
+++ b/budget_forecast/TSD - Budget Forecast 2YF (ZFI_BUD_2YF).docx
@@ -44458,6 +44458,48 @@
           <w:sz w:val="15"/>
           <w:szCs w:val="15"/>
         </w:rPr>
+        <w:t xml:space="preserve">    " SET CURSOR FIELD needs a character-like field (not a string)</w:t>
+      </w:r>
+    </w:p>
+    <w:p>
+      <w:pPr>
+        <w:shd w:fill="F2F2F2" w:color="auto" w:val="clear"/>
+        <w:spacing w:after="0" w:line="228"/>
+      </w:pPr>
+      <w:r>
+        <w:rPr>
+          <w:rFonts w:ascii="Courier New" w:cs="Courier New" w:eastAsia="Courier New" w:hAnsi="Courier New"/>
+          <w:sz w:val="15"/>
+          <w:szCs w:val="15"/>
+        </w:rPr>
+        <w:t xml:space="preserve">    DATA lv_field TYPE c LENGTH 61.</w:t>
+      </w:r>
+    </w:p>
+    <w:p>
+      <w:pPr>
+        <w:shd w:fill="F2F2F2" w:color="auto" w:val="clear"/>
+        <w:spacing w:after="0" w:line="228"/>
+      </w:pPr>
+      <w:r>
+        <w:rPr>
+          <w:rFonts w:ascii="Courier New" w:cs="Courier New" w:eastAsia="Courier New" w:hAnsi="Courier New"/>
+          <w:sz w:val="15"/>
+          <w:szCs w:val="15"/>
+        </w:rPr>
+        <w:t xml:space="preserve"> </w:t>
+      </w:r>
+    </w:p>
+    <w:p>
+      <w:pPr>
+        <w:shd w:fill="F2F2F2" w:color="auto" w:val="clear"/>
+        <w:spacing w:after="0" w:line="228"/>
+      </w:pPr>
+      <w:r>
+        <w:rPr>
+          <w:rFonts w:ascii="Courier New" w:cs="Courier New" w:eastAsia="Courier New" w:hAnsi="Courier New"/>
+          <w:sz w:val="15"/>
+          <w:szCs w:val="15"/>
+        </w:rPr>
         <w:t xml:space="preserve">    IF ix_error-&gt;mv_item_index &gt; 0.</w:t>
       </w:r>
     </w:p>
@@ -44486,7 +44528,7 @@
           <w:sz w:val="15"/>
           <w:szCs w:val="15"/>
         </w:rPr>
-        <w:t xml:space="preserve">      DATA(lv_field) = |GS_ITEM-{ ix_error-&gt;mv_fieldname }|.</w:t>
+        <w:t xml:space="preserve">      lv_field = |GS_ITEM-{ ix_error-&gt;mv_fieldname }|.</w:t>
       </w:r>
     </w:p>
     <w:p>

</xml_diff>

<commit_message>
E-mail: add the budget line items table (create and change)
Co-Authored-By: Claude Opus 5.5 <noreply@anthropic.com>
Claude-Session: https://claude.ai/code/session_018v514gXErg4EbBGrdeHBh4
</commit_message>
<xml_diff>
--- a/budget_forecast/TSD - Budget Forecast 2YF (ZFI_BUD_2YF).docx
+++ b/budget_forecast/TSD - Budget Forecast 2YF (ZFI_BUD_2YF).docx
@@ -20280,6 +20280,20 @@
           <w:sz w:val="15"/>
           <w:szCs w:val="15"/>
         </w:rPr>
+        <w:t xml:space="preserve">              it_items            TYPE zif_fi_bud_2yf_types=&gt;tt_items OPTIONAL</w:t>
+      </w:r>
+    </w:p>
+    <w:p>
+      <w:pPr>
+        <w:shd w:fill="F2F2F2" w:color="auto" w:val="clear"/>
+        <w:spacing w:after="0" w:line="228"/>
+      </w:pPr>
+      <w:r>
+        <w:rPr>
+          <w:rFonts w:ascii="Courier New" w:cs="Courier New" w:eastAsia="Courier New" w:hAnsi="Courier New"/>
+          <w:sz w:val="15"/>
+          <w:szCs w:val="15"/>
+        </w:rPr>
         <w:t xml:space="preserve">    RETURNING VALUE(rv_error)     TYPE string.</w:t>
       </w:r>
     </w:p>
@@ -25374,6 +25388,20 @@
           <w:sz w:val="15"/>
           <w:szCs w:val="15"/>
         </w:rPr>
+        <w:t xml:space="preserve">                it_items        TYPE tt_items OPTIONAL</w:t>
+      </w:r>
+    </w:p>
+    <w:p>
+      <w:pPr>
+        <w:shd w:fill="F2F2F2" w:color="auto" w:val="clear"/>
+        <w:spacing w:after="0" w:line="228"/>
+      </w:pPr>
+      <w:r>
+        <w:rPr>
+          <w:rFonts w:ascii="Courier New" w:cs="Courier New" w:eastAsia="Courier New" w:hAnsi="Courier New"/>
+          <w:sz w:val="15"/>
+          <w:szCs w:val="15"/>
+        </w:rPr>
         <w:t xml:space="preserve">      RETURNING VALUE(rv_error) TYPE string.</w:t>
       </w:r>
     </w:p>
@@ -28272,7 +28300,21 @@
           <w:sz w:val="15"/>
           <w:szCs w:val="15"/>
         </w:rPr>
-        <w:t xml:space="preserve">                                   iv_item_count = lines( lt_items ) ).</w:t>
+        <w:t xml:space="preserve">                                   iv_item_count = lines( lt_items )</w:t>
+      </w:r>
+    </w:p>
+    <w:p>
+      <w:pPr>
+        <w:shd w:fill="F2F2F2" w:color="auto" w:val="clear"/>
+        <w:spacing w:after="0" w:line="228"/>
+      </w:pPr>
+      <w:r>
+        <w:rPr>
+          <w:rFonts w:ascii="Courier New" w:cs="Courier New" w:eastAsia="Courier New" w:hAnsi="Courier New"/>
+          <w:sz w:val="15"/>
+          <w:szCs w:val="15"/>
+        </w:rPr>
+        <w:t xml:space="preserve">                                   it_items      = lt_items ).</w:t>
       </w:r>
     </w:p>
     <w:p>
@@ -28986,7 +29028,21 @@
           <w:sz w:val="15"/>
           <w:szCs w:val="15"/>
         </w:rPr>
-        <w:t xml:space="preserve">                                   it_log        = lt_log ).</w:t>
+        <w:t xml:space="preserve">                                   it_log        = lt_log</w:t>
+      </w:r>
+    </w:p>
+    <w:p>
+      <w:pPr>
+        <w:shd w:fill="F2F2F2" w:color="auto" w:val="clear"/>
+        <w:spacing w:after="0" w:line="228"/>
+      </w:pPr>
+      <w:r>
+        <w:rPr>
+          <w:rFonts w:ascii="Courier New" w:cs="Courier New" w:eastAsia="Courier New" w:hAnsi="Courier New"/>
+          <w:sz w:val="15"/>
+          <w:szCs w:val="15"/>
+        </w:rPr>
+        <w:t xml:space="preserve">                                   it_items      = lt_new ).</w:t>
       </w:r>
     </w:p>
     <w:p>
@@ -31142,6 +31198,20 @@
           <w:sz w:val="15"/>
           <w:szCs w:val="15"/>
         </w:rPr>
+        <w:t xml:space="preserve">      it_items            = it_items</w:t>
+      </w:r>
+    </w:p>
+    <w:p>
+      <w:pPr>
+        <w:shd w:fill="F2F2F2" w:color="auto" w:val="clear"/>
+        <w:spacing w:after="0" w:line="228"/>
+      </w:pPr>
+      <w:r>
+        <w:rPr>
+          <w:rFonts w:ascii="Courier New" w:cs="Courier New" w:eastAsia="Courier New" w:hAnsi="Courier New"/>
+          <w:sz w:val="15"/>
+          <w:szCs w:val="15"/>
+        </w:rPr>
         <w:t xml:space="preserve">      iv_cost_center_text = mo_repository-&gt;get_cost_center_text( iv_bukrs = is_header-bukrs</w:t>
       </w:r>
     </w:p>
@@ -37005,6 +37075,20 @@
           <w:sz w:val="15"/>
           <w:szCs w:val="15"/>
         </w:rPr>
+        <w:t xml:space="preserve">                it_items            TYPE zif_fi_bud_2yf_types=&gt;tt_items</w:t>
+      </w:r>
+    </w:p>
+    <w:p>
+      <w:pPr>
+        <w:shd w:fill="F2F2F2" w:color="auto" w:val="clear"/>
+        <w:spacing w:after="0" w:line="228"/>
+      </w:pPr>
+      <w:r>
+        <w:rPr>
+          <w:rFonts w:ascii="Courier New" w:cs="Courier New" w:eastAsia="Courier New" w:hAnsi="Courier New"/>
+          <w:sz w:val="15"/>
+          <w:szCs w:val="15"/>
+        </w:rPr>
         <w:t xml:space="preserve">      RETURNING VALUE(rv_html)      TYPE string.</w:t>
       </w:r>
     </w:p>
@@ -37033,6 +37117,90 @@
           <w:sz w:val="15"/>
           <w:szCs w:val="15"/>
         </w:rPr>
+        <w:t xml:space="preserve">    "! Budget line items table (all items of the forecast)</w:t>
+      </w:r>
+    </w:p>
+    <w:p>
+      <w:pPr>
+        <w:shd w:fill="F2F2F2" w:color="auto" w:val="clear"/>
+        <w:spacing w:after="0" w:line="228"/>
+      </w:pPr>
+      <w:r>
+        <w:rPr>
+          <w:rFonts w:ascii="Courier New" w:cs="Courier New" w:eastAsia="Courier New" w:hAnsi="Courier New"/>
+          <w:sz w:val="15"/>
+          <w:szCs w:val="15"/>
+        </w:rPr>
+        <w:t xml:space="preserve">    CLASS-METHODS item_table</w:t>
+      </w:r>
+    </w:p>
+    <w:p>
+      <w:pPr>
+        <w:shd w:fill="F2F2F2" w:color="auto" w:val="clear"/>
+        <w:spacing w:after="0" w:line="228"/>
+      </w:pPr>
+      <w:r>
+        <w:rPr>
+          <w:rFonts w:ascii="Courier New" w:cs="Courier New" w:eastAsia="Courier New" w:hAnsi="Courier New"/>
+          <w:sz w:val="15"/>
+          <w:szCs w:val="15"/>
+        </w:rPr>
+        <w:t xml:space="preserve">      IMPORTING it_items       TYPE zif_fi_bud_2yf_types=&gt;tt_items</w:t>
+      </w:r>
+    </w:p>
+    <w:p>
+      <w:pPr>
+        <w:shd w:fill="F2F2F2" w:color="auto" w:val="clear"/>
+        <w:spacing w:after="0" w:line="228"/>
+      </w:pPr>
+      <w:r>
+        <w:rPr>
+          <w:rFonts w:ascii="Courier New" w:cs="Courier New" w:eastAsia="Courier New" w:hAnsi="Courier New"/>
+          <w:sz w:val="15"/>
+          <w:szCs w:val="15"/>
+        </w:rPr>
+        <w:t xml:space="preserve">                iv_currency    TYPE waers</w:t>
+      </w:r>
+    </w:p>
+    <w:p>
+      <w:pPr>
+        <w:shd w:fill="F2F2F2" w:color="auto" w:val="clear"/>
+        <w:spacing w:after="0" w:line="228"/>
+      </w:pPr>
+      <w:r>
+        <w:rPr>
+          <w:rFonts w:ascii="Courier New" w:cs="Courier New" w:eastAsia="Courier New" w:hAnsi="Courier New"/>
+          <w:sz w:val="15"/>
+          <w:szCs w:val="15"/>
+        </w:rPr>
+        <w:t xml:space="preserve">      RETURNING VALUE(rv_html) TYPE string.</w:t>
+      </w:r>
+    </w:p>
+    <w:p>
+      <w:pPr>
+        <w:shd w:fill="F2F2F2" w:color="auto" w:val="clear"/>
+        <w:spacing w:after="0" w:line="228"/>
+      </w:pPr>
+      <w:r>
+        <w:rPr>
+          <w:rFonts w:ascii="Courier New" w:cs="Courier New" w:eastAsia="Courier New" w:hAnsi="Courier New"/>
+          <w:sz w:val="15"/>
+          <w:szCs w:val="15"/>
+        </w:rPr>
+        <w:t xml:space="preserve"> </w:t>
+      </w:r>
+    </w:p>
+    <w:p>
+      <w:pPr>
+        <w:shd w:fill="F2F2F2" w:color="auto" w:val="clear"/>
+        <w:spacing w:after="0" w:line="228"/>
+      </w:pPr>
+      <w:r>
+        <w:rPr>
+          <w:rFonts w:ascii="Courier New" w:cs="Courier New" w:eastAsia="Courier New" w:hAnsi="Courier New"/>
+          <w:sz w:val="15"/>
+          <w:szCs w:val="15"/>
+        </w:rPr>
         <w:t xml:space="preserve">    "! One row of the details table: English label / Arabic label / value</w:t>
       </w:r>
     </w:p>
@@ -37817,7 +37985,21 @@
           <w:sz w:val="15"/>
           <w:szCs w:val="15"/>
         </w:rPr>
-        <w:t xml:space="preserve">      it_log              = it_log ).</w:t>
+        <w:t xml:space="preserve">      it_log              = it_log</w:t>
+      </w:r>
+    </w:p>
+    <w:p>
+      <w:pPr>
+        <w:shd w:fill="F2F2F2" w:color="auto" w:val="clear"/>
+        <w:spacing w:after="0" w:line="228"/>
+      </w:pPr>
+      <w:r>
+        <w:rPr>
+          <w:rFonts w:ascii="Courier New" w:cs="Courier New" w:eastAsia="Courier New" w:hAnsi="Courier New"/>
+          <w:sz w:val="15"/>
+          <w:szCs w:val="15"/>
+        </w:rPr>
+        <w:t xml:space="preserve">      it_items            = it_items ).</w:t>
       </w:r>
     </w:p>
     <w:p>
@@ -39441,6 +39623,118 @@
           <w:sz w:val="15"/>
           <w:szCs w:val="15"/>
         </w:rPr>
+        <w:t xml:space="preserve">      " budget line items (create and change)</w:t>
+      </w:r>
+    </w:p>
+    <w:p>
+      <w:pPr>
+        <w:shd w:fill="F2F2F2" w:color="auto" w:val="clear"/>
+        <w:spacing w:after="0" w:line="228"/>
+      </w:pPr>
+      <w:r>
+        <w:rPr>
+          <w:rFonts w:ascii="Courier New" w:cs="Courier New" w:eastAsia="Courier New" w:hAnsi="Courier New"/>
+          <w:sz w:val="15"/>
+          <w:szCs w:val="15"/>
+        </w:rPr>
+        <w:t xml:space="preserve">      COND string( WHEN it_items IS NOT INITIAL</w:t>
+      </w:r>
+    </w:p>
+    <w:p>
+      <w:pPr>
+        <w:shd w:fill="F2F2F2" w:color="auto" w:val="clear"/>
+        <w:spacing w:after="0" w:line="228"/>
+      </w:pPr>
+      <w:r>
+        <w:rPr>
+          <w:rFonts w:ascii="Courier New" w:cs="Courier New" w:eastAsia="Courier New" w:hAnsi="Courier New"/>
+          <w:sz w:val="15"/>
+          <w:szCs w:val="15"/>
+        </w:rPr>
+        <w:t xml:space="preserve">                   THEN |&lt;tr&gt;&lt;td style="padding:8px 28px 4px 28px"&gt;| &amp;&amp;</w:t>
+      </w:r>
+    </w:p>
+    <w:p>
+      <w:pPr>
+        <w:shd w:fill="F2F2F2" w:color="auto" w:val="clear"/>
+        <w:spacing w:after="0" w:line="228"/>
+      </w:pPr>
+      <w:r>
+        <w:rPr>
+          <w:rFonts w:ascii="Courier New" w:cs="Courier New" w:eastAsia="Courier New" w:hAnsi="Courier New"/>
+          <w:sz w:val="15"/>
+          <w:szCs w:val="15"/>
+        </w:rPr>
+        <w:t xml:space="preserve">                        |&lt;div style="font-size:11pt;font-weight:bold;color:{ c_color-navy }"&gt;Budget Line Items| &amp;&amp;</w:t>
+      </w:r>
+    </w:p>
+    <w:p>
+      <w:pPr>
+        <w:shd w:fill="F2F2F2" w:color="auto" w:val="clear"/>
+        <w:spacing w:after="0" w:line="228"/>
+      </w:pPr>
+      <w:r>
+        <w:rPr>
+          <w:rFonts w:ascii="Courier New" w:cs="Courier New" w:eastAsia="Courier New" w:hAnsi="Courier New"/>
+          <w:sz w:val="15"/>
+          <w:szCs w:val="15"/>
+        </w:rPr>
+        <w:t xml:space="preserve">                        |&lt;span style="float:right" dir="rtl"&gt;بنود الموازنة&lt;/span&gt;&lt;/div&gt;| &amp;&amp;</w:t>
+      </w:r>
+    </w:p>
+    <w:p>
+      <w:pPr>
+        <w:shd w:fill="F2F2F2" w:color="auto" w:val="clear"/>
+        <w:spacing w:after="0" w:line="228"/>
+      </w:pPr>
+      <w:r>
+        <w:rPr>
+          <w:rFonts w:ascii="Courier New" w:cs="Courier New" w:eastAsia="Courier New" w:hAnsi="Courier New"/>
+          <w:sz w:val="15"/>
+          <w:szCs w:val="15"/>
+        </w:rPr>
+        <w:t xml:space="preserve">                        |&lt;/td&gt;&lt;/tr&gt;&lt;tr&gt;&lt;td style="padding:4px 28px 12px 28px"&gt;| &amp;&amp;</w:t>
+      </w:r>
+    </w:p>
+    <w:p>
+      <w:pPr>
+        <w:shd w:fill="F2F2F2" w:color="auto" w:val="clear"/>
+        <w:spacing w:after="0" w:line="228"/>
+      </w:pPr>
+      <w:r>
+        <w:rPr>
+          <w:rFonts w:ascii="Courier New" w:cs="Courier New" w:eastAsia="Courier New" w:hAnsi="Courier New"/>
+          <w:sz w:val="15"/>
+          <w:szCs w:val="15"/>
+        </w:rPr>
+        <w:t xml:space="preserve">                        |{ item_table( it_items = it_items iv_currency = is_header-waers ) }&lt;/td&gt;&lt;/tr&gt;| ) &amp;&amp;</w:t>
+      </w:r>
+    </w:p>
+    <w:p>
+      <w:pPr>
+        <w:shd w:fill="F2F2F2" w:color="auto" w:val="clear"/>
+        <w:spacing w:after="0" w:line="228"/>
+      </w:pPr>
+      <w:r>
+        <w:rPr>
+          <w:rFonts w:ascii="Courier New" w:cs="Courier New" w:eastAsia="Courier New" w:hAnsi="Courier New"/>
+          <w:sz w:val="15"/>
+          <w:szCs w:val="15"/>
+        </w:rPr>
+        <w:t xml:space="preserve"> </w:t>
+      </w:r>
+    </w:p>
+    <w:p>
+      <w:pPr>
+        <w:shd w:fill="F2F2F2" w:color="auto" w:val="clear"/>
+        <w:spacing w:after="0" w:line="228"/>
+      </w:pPr>
+      <w:r>
+        <w:rPr>
+          <w:rFonts w:ascii="Courier New" w:cs="Courier New" w:eastAsia="Courier New" w:hAnsi="Courier New"/>
+          <w:sz w:val="15"/>
+          <w:szCs w:val="15"/>
+        </w:rPr>
         <w:t xml:space="preserve">      " what changed (updates only)</w:t>
       </w:r>
     </w:p>
@@ -39918,6 +40212,538 @@
           <w:szCs w:val="15"/>
         </w:rPr>
         <w:t xml:space="preserve">              |{ condense( CONV string( iv_label_ar ) ) }&lt;/td&gt;&lt;/tr&gt;|.</w:t>
+      </w:r>
+    </w:p>
+    <w:p>
+      <w:pPr>
+        <w:shd w:fill="F2F2F2" w:color="auto" w:val="clear"/>
+        <w:spacing w:after="0" w:line="228"/>
+      </w:pPr>
+      <w:r>
+        <w:rPr>
+          <w:rFonts w:ascii="Courier New" w:cs="Courier New" w:eastAsia="Courier New" w:hAnsi="Courier New"/>
+          <w:sz w:val="15"/>
+          <w:szCs w:val="15"/>
+        </w:rPr>
+        <w:t xml:space="preserve">  ENDMETHOD.</w:t>
+      </w:r>
+    </w:p>
+    <w:p>
+      <w:pPr>
+        <w:shd w:fill="F2F2F2" w:color="auto" w:val="clear"/>
+        <w:spacing w:after="0" w:line="228"/>
+      </w:pPr>
+      <w:r>
+        <w:rPr>
+          <w:rFonts w:ascii="Courier New" w:cs="Courier New" w:eastAsia="Courier New" w:hAnsi="Courier New"/>
+          <w:sz w:val="15"/>
+          <w:szCs w:val="15"/>
+        </w:rPr>
+        <w:t xml:space="preserve"> </w:t>
+      </w:r>
+    </w:p>
+    <w:p>
+      <w:pPr>
+        <w:shd w:fill="F2F2F2" w:color="auto" w:val="clear"/>
+        <w:spacing w:after="0" w:line="228"/>
+      </w:pPr>
+      <w:r>
+        <w:rPr>
+          <w:rFonts w:ascii="Courier New" w:cs="Courier New" w:eastAsia="Courier New" w:hAnsi="Courier New"/>
+          <w:sz w:val="15"/>
+          <w:szCs w:val="15"/>
+        </w:rPr>
+        <w:t xml:space="preserve"> </w:t>
+      </w:r>
+    </w:p>
+    <w:p>
+      <w:pPr>
+        <w:shd w:fill="F2F2F2" w:color="auto" w:val="clear"/>
+        <w:spacing w:after="0" w:line="228"/>
+      </w:pPr>
+      <w:r>
+        <w:rPr>
+          <w:rFonts w:ascii="Courier New" w:cs="Courier New" w:eastAsia="Courier New" w:hAnsi="Courier New"/>
+          <w:sz w:val="15"/>
+          <w:szCs w:val="15"/>
+        </w:rPr>
+        <w:t xml:space="preserve">  METHOD item_table.</w:t>
+      </w:r>
+    </w:p>
+    <w:p>
+      <w:pPr>
+        <w:shd w:fill="F2F2F2" w:color="auto" w:val="clear"/>
+        <w:spacing w:after="0" w:line="228"/>
+      </w:pPr>
+      <w:r>
+        <w:rPr>
+          <w:rFonts w:ascii="Courier New" w:cs="Courier New" w:eastAsia="Courier New" w:hAnsi="Courier New"/>
+          <w:sz w:val="15"/>
+          <w:szCs w:val="15"/>
+        </w:rPr>
+        <w:t xml:space="preserve">    DATA(lv_head) = |style="background:{ c_color-teal };color:#ffffff;padding:6px 8px;text-align:left;font-size:9pt"|.</w:t>
+      </w:r>
+    </w:p>
+    <w:p>
+      <w:pPr>
+        <w:shd w:fill="F2F2F2" w:color="auto" w:val="clear"/>
+        <w:spacing w:after="0" w:line="228"/>
+      </w:pPr>
+      <w:r>
+        <w:rPr>
+          <w:rFonts w:ascii="Courier New" w:cs="Courier New" w:eastAsia="Courier New" w:hAnsi="Courier New"/>
+          <w:sz w:val="15"/>
+          <w:szCs w:val="15"/>
+        </w:rPr>
+        <w:t xml:space="preserve">    DATA(lv_num)  = |style="background:{ c_color-teal };color:#ffffff;padding:6px 8px;text-align:right;font-size:9pt"|.</w:t>
+      </w:r>
+    </w:p>
+    <w:p>
+      <w:pPr>
+        <w:shd w:fill="F2F2F2" w:color="auto" w:val="clear"/>
+        <w:spacing w:after="0" w:line="228"/>
+      </w:pPr>
+      <w:r>
+        <w:rPr>
+          <w:rFonts w:ascii="Courier New" w:cs="Courier New" w:eastAsia="Courier New" w:hAnsi="Courier New"/>
+          <w:sz w:val="15"/>
+          <w:szCs w:val="15"/>
+        </w:rPr>
+        <w:t xml:space="preserve"> </w:t>
+      </w:r>
+    </w:p>
+    <w:p>
+      <w:pPr>
+        <w:shd w:fill="F2F2F2" w:color="auto" w:val="clear"/>
+        <w:spacing w:after="0" w:line="228"/>
+      </w:pPr>
+      <w:r>
+        <w:rPr>
+          <w:rFonts w:ascii="Courier New" w:cs="Courier New" w:eastAsia="Courier New" w:hAnsi="Courier New"/>
+          <w:sz w:val="15"/>
+          <w:szCs w:val="15"/>
+        </w:rPr>
+        <w:t xml:space="preserve">    rv_html = |&lt;table role="presentation" width="100%" cellpadding="0" cellspacing="0" | &amp;&amp;</w:t>
+      </w:r>
+    </w:p>
+    <w:p>
+      <w:pPr>
+        <w:shd w:fill="F2F2F2" w:color="auto" w:val="clear"/>
+        <w:spacing w:after="0" w:line="228"/>
+      </w:pPr>
+      <w:r>
+        <w:rPr>
+          <w:rFonts w:ascii="Courier New" w:cs="Courier New" w:eastAsia="Courier New" w:hAnsi="Courier New"/>
+          <w:sz w:val="15"/>
+          <w:szCs w:val="15"/>
+        </w:rPr>
+        <w:t xml:space="preserve">              |style="border:1px solid #dcdde6;border-collapse:collapse;font-size:9pt"&gt;| &amp;&amp;</w:t>
+      </w:r>
+    </w:p>
+    <w:p>
+      <w:pPr>
+        <w:shd w:fill="F2F2F2" w:color="auto" w:val="clear"/>
+        <w:spacing w:after="0" w:line="228"/>
+      </w:pPr>
+      <w:r>
+        <w:rPr>
+          <w:rFonts w:ascii="Courier New" w:cs="Courier New" w:eastAsia="Courier New" w:hAnsi="Courier New"/>
+          <w:sz w:val="15"/>
+          <w:szCs w:val="15"/>
+        </w:rPr>
+        <w:t xml:space="preserve">              |&lt;tr&gt;&lt;th { lv_head }&gt;#&lt;/th&gt;&lt;th { lv_head }&gt;Year&lt;/th&gt;&lt;th { lv_head }&gt;Project&lt;/th&gt;| &amp;&amp;</w:t>
+      </w:r>
+    </w:p>
+    <w:p>
+      <w:pPr>
+        <w:shd w:fill="F2F2F2" w:color="auto" w:val="clear"/>
+        <w:spacing w:after="0" w:line="228"/>
+      </w:pPr>
+      <w:r>
+        <w:rPr>
+          <w:rFonts w:ascii="Courier New" w:cs="Courier New" w:eastAsia="Courier New" w:hAnsi="Courier New"/>
+          <w:sz w:val="15"/>
+          <w:szCs w:val="15"/>
+        </w:rPr>
+        <w:t xml:space="preserve">              |&lt;th { lv_head }&gt;Priority&lt;/th&gt;&lt;th { lv_head }&gt;Opex/Capex&lt;/th&gt;&lt;th { lv_head }&gt;Type&lt;/th&gt;| &amp;&amp;</w:t>
+      </w:r>
+    </w:p>
+    <w:p>
+      <w:pPr>
+        <w:shd w:fill="F2F2F2" w:color="auto" w:val="clear"/>
+        <w:spacing w:after="0" w:line="228"/>
+      </w:pPr>
+      <w:r>
+        <w:rPr>
+          <w:rFonts w:ascii="Courier New" w:cs="Courier New" w:eastAsia="Courier New" w:hAnsi="Courier New"/>
+          <w:sz w:val="15"/>
+          <w:szCs w:val="15"/>
+        </w:rPr>
+        <w:t xml:space="preserve">              |&lt;th { lv_num }&gt;Budget&lt;/th&gt;&lt;/tr&gt;|.</w:t>
+      </w:r>
+    </w:p>
+    <w:p>
+      <w:pPr>
+        <w:shd w:fill="F2F2F2" w:color="auto" w:val="clear"/>
+        <w:spacing w:after="0" w:line="228"/>
+      </w:pPr>
+      <w:r>
+        <w:rPr>
+          <w:rFonts w:ascii="Courier New" w:cs="Courier New" w:eastAsia="Courier New" w:hAnsi="Courier New"/>
+          <w:sz w:val="15"/>
+          <w:szCs w:val="15"/>
+        </w:rPr>
+        <w:t xml:space="preserve"> </w:t>
+      </w:r>
+    </w:p>
+    <w:p>
+      <w:pPr>
+        <w:shd w:fill="F2F2F2" w:color="auto" w:val="clear"/>
+        <w:spacing w:after="0" w:line="228"/>
+      </w:pPr>
+      <w:r>
+        <w:rPr>
+          <w:rFonts w:ascii="Courier New" w:cs="Courier New" w:eastAsia="Courier New" w:hAnsi="Courier New"/>
+          <w:sz w:val="15"/>
+          <w:szCs w:val="15"/>
+        </w:rPr>
+        <w:t xml:space="preserve">    LOOP AT it_items INTO DATA(ls_item).</w:t>
+      </w:r>
+    </w:p>
+    <w:p>
+      <w:pPr>
+        <w:shd w:fill="F2F2F2" w:color="auto" w:val="clear"/>
+        <w:spacing w:after="0" w:line="228"/>
+      </w:pPr>
+      <w:r>
+        <w:rPr>
+          <w:rFonts w:ascii="Courier New" w:cs="Courier New" w:eastAsia="Courier New" w:hAnsi="Courier New"/>
+          <w:sz w:val="15"/>
+          <w:szCs w:val="15"/>
+        </w:rPr>
+        <w:t xml:space="preserve">      " light striping for readability</w:t>
+      </w:r>
+    </w:p>
+    <w:p>
+      <w:pPr>
+        <w:shd w:fill="F2F2F2" w:color="auto" w:val="clear"/>
+        <w:spacing w:after="0" w:line="228"/>
+      </w:pPr>
+      <w:r>
+        <w:rPr>
+          <w:rFonts w:ascii="Courier New" w:cs="Courier New" w:eastAsia="Courier New" w:hAnsi="Courier New"/>
+          <w:sz w:val="15"/>
+          <w:szCs w:val="15"/>
+        </w:rPr>
+        <w:t xml:space="preserve">      DATA(lv_bg)   = COND string( WHEN sy-tabix MOD 2 = 0 THEN `#F7F8FB` ELSE `#ffffff` ).</w:t>
+      </w:r>
+    </w:p>
+    <w:p>
+      <w:pPr>
+        <w:shd w:fill="F2F2F2" w:color="auto" w:val="clear"/>
+        <w:spacing w:after="0" w:line="228"/>
+      </w:pPr>
+      <w:r>
+        <w:rPr>
+          <w:rFonts w:ascii="Courier New" w:cs="Courier New" w:eastAsia="Courier New" w:hAnsi="Courier New"/>
+          <w:sz w:val="15"/>
+          <w:szCs w:val="15"/>
+        </w:rPr>
+        <w:t xml:space="preserve">      DATA(lv_cell) = |style="padding:6px 8px;border-bottom:1px solid #eeeeee;background:{ lv_bg }"|.</w:t>
+      </w:r>
+    </w:p>
+    <w:p>
+      <w:pPr>
+        <w:shd w:fill="F2F2F2" w:color="auto" w:val="clear"/>
+        <w:spacing w:after="0" w:line="228"/>
+      </w:pPr>
+      <w:r>
+        <w:rPr>
+          <w:rFonts w:ascii="Courier New" w:cs="Courier New" w:eastAsia="Courier New" w:hAnsi="Courier New"/>
+          <w:sz w:val="15"/>
+          <w:szCs w:val="15"/>
+        </w:rPr>
+        <w:t xml:space="preserve"> </w:t>
+      </w:r>
+    </w:p>
+    <w:p>
+      <w:pPr>
+        <w:shd w:fill="F2F2F2" w:color="auto" w:val="clear"/>
+        <w:spacing w:after="0" w:line="228"/>
+      </w:pPr>
+      <w:r>
+        <w:rPr>
+          <w:rFonts w:ascii="Courier New" w:cs="Courier New" w:eastAsia="Courier New" w:hAnsi="Courier New"/>
+          <w:sz w:val="15"/>
+          <w:szCs w:val="15"/>
+        </w:rPr>
+        <w:t xml:space="preserve">      rv_html = rv_html &amp;&amp;</w:t>
+      </w:r>
+    </w:p>
+    <w:p>
+      <w:pPr>
+        <w:shd w:fill="F2F2F2" w:color="auto" w:val="clear"/>
+        <w:spacing w:after="0" w:line="228"/>
+      </w:pPr>
+      <w:r>
+        <w:rPr>
+          <w:rFonts w:ascii="Courier New" w:cs="Courier New" w:eastAsia="Courier New" w:hAnsi="Courier New"/>
+          <w:sz w:val="15"/>
+          <w:szCs w:val="15"/>
+        </w:rPr>
+        <w:t xml:space="preserve">        |&lt;tr&gt;&lt;td { lv_cell }&gt;{ ls_item-item_no ALPHA = OUT }&lt;/td&gt;| &amp;&amp;</w:t>
+      </w:r>
+    </w:p>
+    <w:p>
+      <w:pPr>
+        <w:shd w:fill="F2F2F2" w:color="auto" w:val="clear"/>
+        <w:spacing w:after="0" w:line="228"/>
+      </w:pPr>
+      <w:r>
+        <w:rPr>
+          <w:rFonts w:ascii="Courier New" w:cs="Courier New" w:eastAsia="Courier New" w:hAnsi="Courier New"/>
+          <w:sz w:val="15"/>
+          <w:szCs w:val="15"/>
+        </w:rPr>
+        <w:t xml:space="preserve">        |&lt;td { lv_cell }&gt;{ ls_item-budget_year }&lt;/td&gt;| &amp;&amp;</w:t>
+      </w:r>
+    </w:p>
+    <w:p>
+      <w:pPr>
+        <w:shd w:fill="F2F2F2" w:color="auto" w:val="clear"/>
+        <w:spacing w:after="0" w:line="228"/>
+      </w:pPr>
+      <w:r>
+        <w:rPr>
+          <w:rFonts w:ascii="Courier New" w:cs="Courier New" w:eastAsia="Courier New" w:hAnsi="Courier New"/>
+          <w:sz w:val="15"/>
+          <w:szCs w:val="15"/>
+        </w:rPr>
+        <w:t xml:space="preserve">        |&lt;td { lv_cell } dir="auto"&gt;&lt;b&gt;{ html( ls_item-proj_name ) }&lt;/b&gt;| &amp;&amp;</w:t>
+      </w:r>
+    </w:p>
+    <w:p>
+      <w:pPr>
+        <w:shd w:fill="F2F2F2" w:color="auto" w:val="clear"/>
+        <w:spacing w:after="0" w:line="228"/>
+      </w:pPr>
+      <w:r>
+        <w:rPr>
+          <w:rFonts w:ascii="Courier New" w:cs="Courier New" w:eastAsia="Courier New" w:hAnsi="Courier New"/>
+          <w:sz w:val="15"/>
+          <w:szCs w:val="15"/>
+        </w:rPr>
+        <w:t xml:space="preserve">        |&lt;div style="color:#8a8a8a;font-size:8.5pt"&gt;{ html( ls_item-proj_desc ) }&lt;/div&gt;&lt;/td&gt;| &amp;&amp;</w:t>
+      </w:r>
+    </w:p>
+    <w:p>
+      <w:pPr>
+        <w:shd w:fill="F2F2F2" w:color="auto" w:val="clear"/>
+        <w:spacing w:after="0" w:line="228"/>
+      </w:pPr>
+      <w:r>
+        <w:rPr>
+          <w:rFonts w:ascii="Courier New" w:cs="Courier New" w:eastAsia="Courier New" w:hAnsi="Courier New"/>
+          <w:sz w:val="15"/>
+          <w:szCs w:val="15"/>
+        </w:rPr>
+        <w:t xml:space="preserve">        |&lt;td { lv_cell }&gt;{ ls_item-priority }&lt;/td&gt;| &amp;&amp;</w:t>
+      </w:r>
+    </w:p>
+    <w:p>
+      <w:pPr>
+        <w:shd w:fill="F2F2F2" w:color="auto" w:val="clear"/>
+        <w:spacing w:after="0" w:line="228"/>
+      </w:pPr>
+      <w:r>
+        <w:rPr>
+          <w:rFonts w:ascii="Courier New" w:cs="Courier New" w:eastAsia="Courier New" w:hAnsi="Courier New"/>
+          <w:sz w:val="15"/>
+          <w:szCs w:val="15"/>
+        </w:rPr>
+        <w:t xml:space="preserve">        |&lt;td { lv_cell }&gt;{ ls_item-bud_type }&lt;/td&gt;| &amp;&amp;</w:t>
+      </w:r>
+    </w:p>
+    <w:p>
+      <w:pPr>
+        <w:shd w:fill="F2F2F2" w:color="auto" w:val="clear"/>
+        <w:spacing w:after="0" w:line="228"/>
+      </w:pPr>
+      <w:r>
+        <w:rPr>
+          <w:rFonts w:ascii="Courier New" w:cs="Courier New" w:eastAsia="Courier New" w:hAnsi="Courier New"/>
+          <w:sz w:val="15"/>
+          <w:szCs w:val="15"/>
+        </w:rPr>
+        <w:t xml:space="preserve">        |&lt;td { lv_cell }&gt;{ ls_item-proj_type }&lt;/td&gt;| &amp;&amp;</w:t>
+      </w:r>
+    </w:p>
+    <w:p>
+      <w:pPr>
+        <w:shd w:fill="F2F2F2" w:color="auto" w:val="clear"/>
+        <w:spacing w:after="0" w:line="228"/>
+      </w:pPr>
+      <w:r>
+        <w:rPr>
+          <w:rFonts w:ascii="Courier New" w:cs="Courier New" w:eastAsia="Courier New" w:hAnsi="Courier New"/>
+          <w:sz w:val="15"/>
+          <w:szCs w:val="15"/>
+        </w:rPr>
+        <w:t xml:space="preserve">        |&lt;td { lv_cell } align="right" nowrap&gt;{ ls_item-amount NUMBER = USER }&lt;/td&gt;&lt;/tr&gt;|.</w:t>
+      </w:r>
+    </w:p>
+    <w:p>
+      <w:pPr>
+        <w:shd w:fill="F2F2F2" w:color="auto" w:val="clear"/>
+        <w:spacing w:after="0" w:line="228"/>
+      </w:pPr>
+      <w:r>
+        <w:rPr>
+          <w:rFonts w:ascii="Courier New" w:cs="Courier New" w:eastAsia="Courier New" w:hAnsi="Courier New"/>
+          <w:sz w:val="15"/>
+          <w:szCs w:val="15"/>
+        </w:rPr>
+        <w:t xml:space="preserve">    ENDLOOP.</w:t>
+      </w:r>
+    </w:p>
+    <w:p>
+      <w:pPr>
+        <w:shd w:fill="F2F2F2" w:color="auto" w:val="clear"/>
+        <w:spacing w:after="0" w:line="228"/>
+      </w:pPr>
+      <w:r>
+        <w:rPr>
+          <w:rFonts w:ascii="Courier New" w:cs="Courier New" w:eastAsia="Courier New" w:hAnsi="Courier New"/>
+          <w:sz w:val="15"/>
+          <w:szCs w:val="15"/>
+        </w:rPr>
+        <w:t xml:space="preserve"> </w:t>
+      </w:r>
+    </w:p>
+    <w:p>
+      <w:pPr>
+        <w:shd w:fill="F2F2F2" w:color="auto" w:val="clear"/>
+        <w:spacing w:after="0" w:line="228"/>
+      </w:pPr>
+      <w:r>
+        <w:rPr>
+          <w:rFonts w:ascii="Courier New" w:cs="Courier New" w:eastAsia="Courier New" w:hAnsi="Courier New"/>
+          <w:sz w:val="15"/>
+          <w:szCs w:val="15"/>
+        </w:rPr>
+        <w:t xml:space="preserve">    " total line</w:t>
+      </w:r>
+    </w:p>
+    <w:p>
+      <w:pPr>
+        <w:shd w:fill="F2F2F2" w:color="auto" w:val="clear"/>
+        <w:spacing w:after="0" w:line="228"/>
+      </w:pPr>
+      <w:r>
+        <w:rPr>
+          <w:rFonts w:ascii="Courier New" w:cs="Courier New" w:eastAsia="Courier New" w:hAnsi="Courier New"/>
+          <w:sz w:val="15"/>
+          <w:szCs w:val="15"/>
+        </w:rPr>
+        <w:t xml:space="preserve">    DATA(lv_total) = REDUCE zfcst_amount( INIT lv_sum TYPE zfcst_amount</w:t>
+      </w:r>
+    </w:p>
+    <w:p>
+      <w:pPr>
+        <w:shd w:fill="F2F2F2" w:color="auto" w:val="clear"/>
+        <w:spacing w:after="0" w:line="228"/>
+      </w:pPr>
+      <w:r>
+        <w:rPr>
+          <w:rFonts w:ascii="Courier New" w:cs="Courier New" w:eastAsia="Courier New" w:hAnsi="Courier New"/>
+          <w:sz w:val="15"/>
+          <w:szCs w:val="15"/>
+        </w:rPr>
+        <w:t xml:space="preserve">                                          FOR ls_line IN it_items</w:t>
+      </w:r>
+    </w:p>
+    <w:p>
+      <w:pPr>
+        <w:shd w:fill="F2F2F2" w:color="auto" w:val="clear"/>
+        <w:spacing w:after="0" w:line="228"/>
+      </w:pPr>
+      <w:r>
+        <w:rPr>
+          <w:rFonts w:ascii="Courier New" w:cs="Courier New" w:eastAsia="Courier New" w:hAnsi="Courier New"/>
+          <w:sz w:val="15"/>
+          <w:szCs w:val="15"/>
+        </w:rPr>
+        <w:t xml:space="preserve">                                          NEXT lv_sum = lv_sum + ls_line-amount ).</w:t>
+      </w:r>
+    </w:p>
+    <w:p>
+      <w:pPr>
+        <w:shd w:fill="F2F2F2" w:color="auto" w:val="clear"/>
+        <w:spacing w:after="0" w:line="228"/>
+      </w:pPr>
+      <w:r>
+        <w:rPr>
+          <w:rFonts w:ascii="Courier New" w:cs="Courier New" w:eastAsia="Courier New" w:hAnsi="Courier New"/>
+          <w:sz w:val="15"/>
+          <w:szCs w:val="15"/>
+        </w:rPr>
+        <w:t xml:space="preserve">    rv_html = rv_html &amp;&amp;</w:t>
+      </w:r>
+    </w:p>
+    <w:p>
+      <w:pPr>
+        <w:shd w:fill="F2F2F2" w:color="auto" w:val="clear"/>
+        <w:spacing w:after="0" w:line="228"/>
+      </w:pPr>
+      <w:r>
+        <w:rPr>
+          <w:rFonts w:ascii="Courier New" w:cs="Courier New" w:eastAsia="Courier New" w:hAnsi="Courier New"/>
+          <w:sz w:val="15"/>
+          <w:szCs w:val="15"/>
+        </w:rPr>
+        <w:t xml:space="preserve">      |&lt;tr&gt;&lt;td colspan="6" style="padding:7px 8px;background:{ c_color-label_bg };font-weight:bold;| &amp;&amp;</w:t>
+      </w:r>
+    </w:p>
+    <w:p>
+      <w:pPr>
+        <w:shd w:fill="F2F2F2" w:color="auto" w:val="clear"/>
+        <w:spacing w:after="0" w:line="228"/>
+      </w:pPr>
+      <w:r>
+        <w:rPr>
+          <w:rFonts w:ascii="Courier New" w:cs="Courier New" w:eastAsia="Courier New" w:hAnsi="Courier New"/>
+          <w:sz w:val="15"/>
+          <w:szCs w:val="15"/>
+        </w:rPr>
+        <w:t xml:space="preserve">      |color:{ c_color-navy_dark }"&gt;Total&lt;/td&gt;| &amp;&amp;</w:t>
+      </w:r>
+    </w:p>
+    <w:p>
+      <w:pPr>
+        <w:shd w:fill="F2F2F2" w:color="auto" w:val="clear"/>
+        <w:spacing w:after="0" w:line="228"/>
+      </w:pPr>
+      <w:r>
+        <w:rPr>
+          <w:rFonts w:ascii="Courier New" w:cs="Courier New" w:eastAsia="Courier New" w:hAnsi="Courier New"/>
+          <w:sz w:val="15"/>
+          <w:szCs w:val="15"/>
+        </w:rPr>
+        <w:t xml:space="preserve">      |&lt;td align="right" nowrap style="padding:7px 8px;background:{ c_color-label_bg };font-weight:bold;| &amp;&amp;</w:t>
+      </w:r>
+    </w:p>
+    <w:p>
+      <w:pPr>
+        <w:shd w:fill="F2F2F2" w:color="auto" w:val="clear"/>
+        <w:spacing w:after="0" w:line="228"/>
+      </w:pPr>
+      <w:r>
+        <w:rPr>
+          <w:rFonts w:ascii="Courier New" w:cs="Courier New" w:eastAsia="Courier New" w:hAnsi="Courier New"/>
+          <w:sz w:val="15"/>
+          <w:szCs w:val="15"/>
+        </w:rPr>
+        <w:t xml:space="preserve">      |color:{ c_color-blue }"&gt;{ lv_total NUMBER = USER } { iv_currency }&lt;/td&gt;&lt;/tr&gt;&lt;/table&gt;|.</w:t>
       </w:r>
     </w:p>
     <w:p>

</xml_diff>

<commit_message>
E-mail: show the company code name next to the company code
Co-Authored-By: Claude Opus 5.5 <noreply@anthropic.com>
Claude-Session: https://claude.ai/code/session_018v514gXErg4EbBGrdeHBh4
</commit_message>
<xml_diff>
--- a/budget_forecast/TSD - Budget Forecast 2YF (ZFI_BUD_2YF).docx
+++ b/budget_forecast/TSD - Budget Forecast 2YF (ZFI_BUD_2YF).docx
@@ -38937,6 +38937,104 @@
           <w:sz w:val="15"/>
           <w:szCs w:val="15"/>
         </w:rPr>
+        <w:t xml:space="preserve"> </w:t>
+      </w:r>
+    </w:p>
+    <w:p>
+      <w:pPr>
+        <w:shd w:fill="F2F2F2" w:color="auto" w:val="clear"/>
+        <w:spacing w:after="0" w:line="228"/>
+      </w:pPr>
+      <w:r>
+        <w:rPr>
+          <w:rFonts w:ascii="Courier New" w:cs="Courier New" w:eastAsia="Courier New" w:hAnsi="Courier New"/>
+          <w:sz w:val="15"/>
+          <w:szCs w:val="15"/>
+        </w:rPr>
+        <w:t xml:space="preserve">    " company code name (released CDS view I_CompanyCode)</w:t>
+      </w:r>
+    </w:p>
+    <w:p>
+      <w:pPr>
+        <w:shd w:fill="F2F2F2" w:color="auto" w:val="clear"/>
+        <w:spacing w:after="0" w:line="228"/>
+      </w:pPr>
+      <w:r>
+        <w:rPr>
+          <w:rFonts w:ascii="Courier New" w:cs="Courier New" w:eastAsia="Courier New" w:hAnsi="Courier New"/>
+          <w:sz w:val="15"/>
+          <w:szCs w:val="15"/>
+        </w:rPr>
+        <w:t xml:space="preserve">    SELECT SINGLE companycodename</w:t>
+      </w:r>
+    </w:p>
+    <w:p>
+      <w:pPr>
+        <w:shd w:fill="F2F2F2" w:color="auto" w:val="clear"/>
+        <w:spacing w:after="0" w:line="228"/>
+      </w:pPr>
+      <w:r>
+        <w:rPr>
+          <w:rFonts w:ascii="Courier New" w:cs="Courier New" w:eastAsia="Courier New" w:hAnsi="Courier New"/>
+          <w:sz w:val="15"/>
+          <w:szCs w:val="15"/>
+        </w:rPr>
+        <w:t xml:space="preserve">      FROM i_companycode</w:t>
+      </w:r>
+    </w:p>
+    <w:p>
+      <w:pPr>
+        <w:shd w:fill="F2F2F2" w:color="auto" w:val="clear"/>
+        <w:spacing w:after="0" w:line="228"/>
+      </w:pPr>
+      <w:r>
+        <w:rPr>
+          <w:rFonts w:ascii="Courier New" w:cs="Courier New" w:eastAsia="Courier New" w:hAnsi="Courier New"/>
+          <w:sz w:val="15"/>
+          <w:szCs w:val="15"/>
+        </w:rPr>
+        <w:t xml:space="preserve">      WHERE companycode = @is_header-bukrs</w:t>
+      </w:r>
+    </w:p>
+    <w:p>
+      <w:pPr>
+        <w:shd w:fill="F2F2F2" w:color="auto" w:val="clear"/>
+        <w:spacing w:after="0" w:line="228"/>
+      </w:pPr>
+      <w:r>
+        <w:rPr>
+          <w:rFonts w:ascii="Courier New" w:cs="Courier New" w:eastAsia="Courier New" w:hAnsi="Courier New"/>
+          <w:sz w:val="15"/>
+          <w:szCs w:val="15"/>
+        </w:rPr>
+        <w:t xml:space="preserve">      INTO @DATA(lv_company_name).</w:t>
+      </w:r>
+    </w:p>
+    <w:p>
+      <w:pPr>
+        <w:shd w:fill="F2F2F2" w:color="auto" w:val="clear"/>
+        <w:spacing w:after="0" w:line="228"/>
+      </w:pPr>
+      <w:r>
+        <w:rPr>
+          <w:rFonts w:ascii="Courier New" w:cs="Courier New" w:eastAsia="Courier New" w:hAnsi="Courier New"/>
+          <w:sz w:val="15"/>
+          <w:szCs w:val="15"/>
+        </w:rPr>
+        <w:t xml:space="preserve"> </w:t>
+      </w:r>
+    </w:p>
+    <w:p>
+      <w:pPr>
+        <w:shd w:fill="F2F2F2" w:color="auto" w:val="clear"/>
+        <w:spacing w:after="0" w:line="228"/>
+      </w:pPr>
+      <w:r>
+        <w:rPr>
+          <w:rFonts w:ascii="Courier New" w:cs="Courier New" w:eastAsia="Courier New" w:hAnsi="Courier New"/>
+          <w:sz w:val="15"/>
+          <w:szCs w:val="15"/>
+        </w:rPr>
         <w:t xml:space="preserve">    DATA(lv_total) = |&lt;span style="color:{ c_color-blue };font-weight:bold;font-size:12pt"&gt;| &amp;&amp;</w:t>
       </w:r>
     </w:p>
@@ -39385,7 +39483,21 @@
           <w:sz w:val="15"/>
           <w:szCs w:val="15"/>
         </w:rPr>
-        <w:t xml:space="preserve">                  iv_value    = CONV #( is_header-bukrs ) ) &amp;&amp;</w:t>
+        <w:t xml:space="preserve">                  iv_value    = COND #( WHEN lv_company_name IS INITIAL THEN CONV string( is_header-bukrs )</w:t>
+      </w:r>
+    </w:p>
+    <w:p>
+      <w:pPr>
+        <w:shd w:fill="F2F2F2" w:color="auto" w:val="clear"/>
+        <w:spacing w:after="0" w:line="228"/>
+      </w:pPr>
+      <w:r>
+        <w:rPr>
+          <w:rFonts w:ascii="Courier New" w:cs="Courier New" w:eastAsia="Courier New" w:hAnsi="Courier New"/>
+          <w:sz w:val="15"/>
+          <w:szCs w:val="15"/>
+        </w:rPr>
+        <w:t xml:space="preserve">                                        ELSE |{ is_header-bukrs } - { html( lv_company_name ) }| ) ) &amp;&amp;</w:t>
       </w:r>
     </w:p>
     <w:p>

</xml_diff>

<commit_message>
E-mail: remove the transaction code, add optional Fiori link button
Co-Authored-By: Claude Opus 5.5 <noreply@anthropic.com>
Claude-Session: https://claude.ai/code/session_018v514gXErg4EbBGrdeHBh4
</commit_message>
<xml_diff>
--- a/budget_forecast/TSD - Budget Forecast 2YF (ZFI_BUD_2YF).docx
+++ b/budget_forecast/TSD - Budget Forecast 2YF (ZFI_BUD_2YF).docx
@@ -36935,6 +36935,62 @@
           <w:sz w:val="15"/>
           <w:szCs w:val="15"/>
         </w:rPr>
+        <w:t xml:space="preserve">    "! Link of the Fiori app for the reviewers - fill it when the Fiori</w:t>
+      </w:r>
+    </w:p>
+    <w:p>
+      <w:pPr>
+        <w:shd w:fill="F2F2F2" w:color="auto" w:val="clear"/>
+        <w:spacing w:after="0" w:line="228"/>
+      </w:pPr>
+      <w:r>
+        <w:rPr>
+          <w:rFonts w:ascii="Courier New" w:cs="Courier New" w:eastAsia="Courier New" w:hAnsi="Courier New"/>
+          <w:sz w:val="15"/>
+          <w:szCs w:val="15"/>
+        </w:rPr>
+        <w:t xml:space="preserve">    "! tile is available; while empty, no link / button is shown</w:t>
+      </w:r>
+    </w:p>
+    <w:p>
+      <w:pPr>
+        <w:shd w:fill="F2F2F2" w:color="auto" w:val="clear"/>
+        <w:spacing w:after="0" w:line="228"/>
+      </w:pPr>
+      <w:r>
+        <w:rPr>
+          <w:rFonts w:ascii="Courier New" w:cs="Courier New" w:eastAsia="Courier New" w:hAnsi="Courier New"/>
+          <w:sz w:val="15"/>
+          <w:szCs w:val="15"/>
+        </w:rPr>
+        <w:t xml:space="preserve">    CONSTANTS c_fiori_url TYPE string VALUE ``.</w:t>
+      </w:r>
+    </w:p>
+    <w:p>
+      <w:pPr>
+        <w:shd w:fill="F2F2F2" w:color="auto" w:val="clear"/>
+        <w:spacing w:after="0" w:line="228"/>
+      </w:pPr>
+      <w:r>
+        <w:rPr>
+          <w:rFonts w:ascii="Courier New" w:cs="Courier New" w:eastAsia="Courier New" w:hAnsi="Courier New"/>
+          <w:sz w:val="15"/>
+          <w:szCs w:val="15"/>
+        </w:rPr>
+        <w:t xml:space="preserve"> </w:t>
+      </w:r>
+    </w:p>
+    <w:p>
+      <w:pPr>
+        <w:shd w:fill="F2F2F2" w:color="auto" w:val="clear"/>
+        <w:spacing w:after="0" w:line="228"/>
+      </w:pPr>
+      <w:r>
+        <w:rPr>
+          <w:rFonts w:ascii="Courier New" w:cs="Courier New" w:eastAsia="Courier New" w:hAnsi="Courier New"/>
+          <w:sz w:val="15"/>
+          <w:szCs w:val="15"/>
+        </w:rPr>
         <w:t xml:space="preserve">    "! Max. number of change lines listed in the mail</w:t>
       </w:r>
     </w:p>
@@ -39945,133 +40001,91 @@
           <w:sz w:val="15"/>
           <w:szCs w:val="15"/>
         </w:rPr>
-        <w:t xml:space="preserve">      " call to action</w:t>
-      </w:r>
-    </w:p>
-    <w:p>
-      <w:pPr>
-        <w:shd w:fill="F2F2F2" w:color="auto" w:val="clear"/>
-        <w:spacing w:after="0" w:line="228"/>
-      </w:pPr>
-      <w:r>
-        <w:rPr>
-          <w:rFonts w:ascii="Courier New" w:cs="Courier New" w:eastAsia="Courier New" w:hAnsi="Courier New"/>
-          <w:sz w:val="15"/>
-          <w:szCs w:val="15"/>
-        </w:rPr>
-        <w:t xml:space="preserve">      |&lt;tr&gt;&lt;td style="padding:10px 28px 22px 28px"&gt;| &amp;&amp;</w:t>
-      </w:r>
-    </w:p>
-    <w:p>
-      <w:pPr>
-        <w:shd w:fill="F2F2F2" w:color="auto" w:val="clear"/>
-        <w:spacing w:after="0" w:line="228"/>
-      </w:pPr>
-      <w:r>
-        <w:rPr>
-          <w:rFonts w:ascii="Courier New" w:cs="Courier New" w:eastAsia="Courier New" w:hAnsi="Courier New"/>
-          <w:sz w:val="15"/>
-          <w:szCs w:val="15"/>
-        </w:rPr>
-        <w:t xml:space="preserve">      |&lt;table role="presentation" width="100%" cellpadding="0" cellspacing="0"&gt;&lt;tr&gt;| &amp;&amp;</w:t>
-      </w:r>
-    </w:p>
-    <w:p>
-      <w:pPr>
-        <w:shd w:fill="F2F2F2" w:color="auto" w:val="clear"/>
-        <w:spacing w:after="0" w:line="228"/>
-      </w:pPr>
-      <w:r>
-        <w:rPr>
-          <w:rFonts w:ascii="Courier New" w:cs="Courier New" w:eastAsia="Courier New" w:hAnsi="Courier New"/>
-          <w:sz w:val="15"/>
-          <w:szCs w:val="15"/>
-        </w:rPr>
-        <w:t xml:space="preserve">      |&lt;td style="background:#EAF6F5;border-left:4px solid { c_color-teal };padding:12px 14px;font-size:10pt"&gt;| &amp;&amp;</w:t>
-      </w:r>
-    </w:p>
-    <w:p>
-      <w:pPr>
-        <w:shd w:fill="F2F2F2" w:color="auto" w:val="clear"/>
-        <w:spacing w:after="0" w:line="228"/>
-      </w:pPr>
-      <w:r>
-        <w:rPr>
-          <w:rFonts w:ascii="Courier New" w:cs="Courier New" w:eastAsia="Courier New" w:hAnsi="Courier New"/>
-          <w:sz w:val="15"/>
-          <w:szCs w:val="15"/>
-        </w:rPr>
-        <w:t xml:space="preserve">      |Review the submission and its change history in SAP, transaction | &amp;&amp;</w:t>
-      </w:r>
-    </w:p>
-    <w:p>
-      <w:pPr>
-        <w:shd w:fill="F2F2F2" w:color="auto" w:val="clear"/>
-        <w:spacing w:after="0" w:line="228"/>
-      </w:pPr>
-      <w:r>
-        <w:rPr>
-          <w:rFonts w:ascii="Courier New" w:cs="Courier New" w:eastAsia="Courier New" w:hAnsi="Courier New"/>
-          <w:sz w:val="15"/>
-          <w:szCs w:val="15"/>
-        </w:rPr>
-        <w:t xml:space="preserve">      |&lt;b style="color:{ c_color-navy }"&gt;{ zif_fi_bud_2yf_types=&gt;c_tcode-report }&lt;/b&gt; | &amp;&amp;</w:t>
-      </w:r>
-    </w:p>
-    <w:p>
-      <w:pPr>
-        <w:shd w:fill="F2F2F2" w:color="auto" w:val="clear"/>
-        <w:spacing w:after="0" w:line="228"/>
-      </w:pPr>
-      <w:r>
-        <w:rPr>
-          <w:rFonts w:ascii="Courier New" w:cs="Courier New" w:eastAsia="Courier New" w:hAnsi="Courier New"/>
-          <w:sz w:val="15"/>
-          <w:szCs w:val="15"/>
-        </w:rPr>
-        <w:t xml:space="preserve">      |(Consolidated Budget Forecast Report).| &amp;&amp;</w:t>
-      </w:r>
-    </w:p>
-    <w:p>
-      <w:pPr>
-        <w:shd w:fill="F2F2F2" w:color="auto" w:val="clear"/>
-        <w:spacing w:after="0" w:line="228"/>
-      </w:pPr>
-      <w:r>
-        <w:rPr>
-          <w:rFonts w:ascii="Courier New" w:cs="Courier New" w:eastAsia="Courier New" w:hAnsi="Courier New"/>
-          <w:sz w:val="15"/>
-          <w:szCs w:val="15"/>
-        </w:rPr>
-        <w:t xml:space="preserve">      |&lt;div dir="rtl" align="right" style="padding-top:4px"&gt;للمراجعة: المعاملة | &amp;&amp;</w:t>
-      </w:r>
-    </w:p>
-    <w:p>
-      <w:pPr>
-        <w:shd w:fill="F2F2F2" w:color="auto" w:val="clear"/>
-        <w:spacing w:after="0" w:line="228"/>
-      </w:pPr>
-      <w:r>
-        <w:rPr>
-          <w:rFonts w:ascii="Courier New" w:cs="Courier New" w:eastAsia="Courier New" w:hAnsi="Courier New"/>
-          <w:sz w:val="15"/>
-          <w:szCs w:val="15"/>
-        </w:rPr>
-        <w:t xml:space="preserve">      |{ zif_fi_bud_2yf_types=&gt;c_tcode-report } في نظام SAP.&lt;/div&gt;| &amp;&amp;</w:t>
-      </w:r>
-    </w:p>
-    <w:p>
-      <w:pPr>
-        <w:shd w:fill="F2F2F2" w:color="auto" w:val="clear"/>
-        <w:spacing w:after="0" w:line="228"/>
-      </w:pPr>
-      <w:r>
-        <w:rPr>
-          <w:rFonts w:ascii="Courier New" w:cs="Courier New" w:eastAsia="Courier New" w:hAnsi="Courier New"/>
-          <w:sz w:val="15"/>
-          <w:szCs w:val="15"/>
-        </w:rPr>
-        <w:t xml:space="preserve">      |&lt;/td&gt;&lt;/tr&gt;&lt;/table&gt;&lt;/td&gt;&lt;/tr&gt;| &amp;&amp;</w:t>
+        <w:t xml:space="preserve">      " link to the Fiori app (shown only when C_FIORI_URL is filled)</w:t>
+      </w:r>
+    </w:p>
+    <w:p>
+      <w:pPr>
+        <w:shd w:fill="F2F2F2" w:color="auto" w:val="clear"/>
+        <w:spacing w:after="0" w:line="228"/>
+      </w:pPr>
+      <w:r>
+        <w:rPr>
+          <w:rFonts w:ascii="Courier New" w:cs="Courier New" w:eastAsia="Courier New" w:hAnsi="Courier New"/>
+          <w:sz w:val="15"/>
+          <w:szCs w:val="15"/>
+        </w:rPr>
+        <w:t xml:space="preserve">      COND string( WHEN c_fiori_url IS NOT INITIAL</w:t>
+      </w:r>
+    </w:p>
+    <w:p>
+      <w:pPr>
+        <w:shd w:fill="F2F2F2" w:color="auto" w:val="clear"/>
+        <w:spacing w:after="0" w:line="228"/>
+      </w:pPr>
+      <w:r>
+        <w:rPr>
+          <w:rFonts w:ascii="Courier New" w:cs="Courier New" w:eastAsia="Courier New" w:hAnsi="Courier New"/>
+          <w:sz w:val="15"/>
+          <w:szCs w:val="15"/>
+        </w:rPr>
+        <w:t xml:space="preserve">                   THEN |&lt;tr&gt;&lt;td align="center" style="padding:10px 28px 22px 28px"&gt;| &amp;&amp;</w:t>
+      </w:r>
+    </w:p>
+    <w:p>
+      <w:pPr>
+        <w:shd w:fill="F2F2F2" w:color="auto" w:val="clear"/>
+        <w:spacing w:after="0" w:line="228"/>
+      </w:pPr>
+      <w:r>
+        <w:rPr>
+          <w:rFonts w:ascii="Courier New" w:cs="Courier New" w:eastAsia="Courier New" w:hAnsi="Courier New"/>
+          <w:sz w:val="15"/>
+          <w:szCs w:val="15"/>
+        </w:rPr>
+        <w:t xml:space="preserve">                        |&lt;a href="{ c_fiori_url }" style="display:inline-block;background:{ c_color-teal };| &amp;&amp;</w:t>
+      </w:r>
+    </w:p>
+    <w:p>
+      <w:pPr>
+        <w:shd w:fill="F2F2F2" w:color="auto" w:val="clear"/>
+        <w:spacing w:after="0" w:line="228"/>
+      </w:pPr>
+      <w:r>
+        <w:rPr>
+          <w:rFonts w:ascii="Courier New" w:cs="Courier New" w:eastAsia="Courier New" w:hAnsi="Courier New"/>
+          <w:sz w:val="15"/>
+          <w:szCs w:val="15"/>
+        </w:rPr>
+        <w:t xml:space="preserve">                        |color:#ffffff;text-decoration:none;font-weight:bold;font-size:10.5pt;| &amp;&amp;</w:t>
+      </w:r>
+    </w:p>
+    <w:p>
+      <w:pPr>
+        <w:shd w:fill="F2F2F2" w:color="auto" w:val="clear"/>
+        <w:spacing w:after="0" w:line="228"/>
+      </w:pPr>
+      <w:r>
+        <w:rPr>
+          <w:rFonts w:ascii="Courier New" w:cs="Courier New" w:eastAsia="Courier New" w:hAnsi="Courier New"/>
+          <w:sz w:val="15"/>
+          <w:szCs w:val="15"/>
+        </w:rPr>
+        <w:t xml:space="preserve">                        |padding:10px 26px;border-radius:4px"&gt;Open Budget Forecast &amp;nbsp;\|&amp;nbsp; فتح الموازنة التقديرية&lt;/a&gt;| &amp;&amp;</w:t>
+      </w:r>
+    </w:p>
+    <w:p>
+      <w:pPr>
+        <w:shd w:fill="F2F2F2" w:color="auto" w:val="clear"/>
+        <w:spacing w:after="0" w:line="228"/>
+      </w:pPr>
+      <w:r>
+        <w:rPr>
+          <w:rFonts w:ascii="Courier New" w:cs="Courier New" w:eastAsia="Courier New" w:hAnsi="Courier New"/>
+          <w:sz w:val="15"/>
+          <w:szCs w:val="15"/>
+        </w:rPr>
+        <w:t xml:space="preserve">                        |&lt;/td&gt;&lt;/tr&gt;| ) &amp;&amp;</w:t>
       </w:r>
     </w:p>
     <w:p>

</xml_diff>